<commit_message>
annotation (mandetta_quotes): Classify 50 tweets pairs [100-150] + updated relatorio_PGC
</commit_message>
<xml_diff>
--- a/docs/PGC_ANALISE_DE_CONFLITOS_EM_REDES_SOCIAIS.docx
+++ b/docs/PGC_ANALISE_DE_CONFLITOS_EM_REDES_SOCIAIS.docx
@@ -2772,7 +2772,7 @@
         <w:rPr>
           <w:rtl w:val="0"/>
         </w:rPr>
-        <w:t xml:space="preserve">Introduzir o conceito de transformers</w:t>
+        <w:t xml:space="preserve">Introduzir o conceito de transformers, tarefa, exemplos</w:t>
       </w:r>
     </w:p>
     <w:p>
@@ -2807,7 +2807,7 @@
         <w:rPr>
           <w:rtl w:val="0"/>
         </w:rPr>
-        <w:t xml:space="preserve">Introduzir, sem tamanha formalidade matemática, a arquitetura de um transformer, dando noção sobre attention, embeddings, contexto bidirecional</w:t>
+        <w:t xml:space="preserve">Introduzir, sem tamanha formalidade matemática, a arquitetura de um transformer, dando noção sobre attention, embeddings, contexto bidirecional.</w:t>
       </w:r>
     </w:p>
     <w:p>
@@ -2836,13 +2836,139 @@
     </w:p>
     <w:p>
       <w:pPr>
-        <w:rPr/>
-      </w:pPr>
-      <w:r>
-        <w:rPr>
-          <w:rtl w:val="0"/>
-        </w:rPr>
-        <w:t xml:space="preserve">Introduzir uma noção da arquitetura do modelo BERT, citando o pre treinamento, masked language modeling, ajuste fino, camada de classificação e etc.</w:t>
+        <w:rPr>
+          <w:highlight w:val="yellow"/>
+        </w:rPr>
+      </w:pPr>
+      <w:r>
+        <w:rPr>
+          <w:rtl w:val="0"/>
+        </w:rPr>
+      </w:r>
+    </w:p>
+    <w:p>
+      <w:pPr>
+        <w:rPr/>
+      </w:pPr>
+      <w:r>
+        <w:rPr>
+          <w:rtl w:val="0"/>
+        </w:rPr>
+        <w:t xml:space="preserve">O </w:t>
+      </w:r>
+      <w:r>
+        <w:rPr>
+          <w:i w:val="1"/>
+          <w:iCs w:val="1"/>
+          <w:rtl w:val="0"/>
+        </w:rPr>
+        <w:t xml:space="preserve">Bidirectional Encoder Representations from Transformers</w:t>
+      </w:r>
+      <w:r>
+        <w:rPr>
+          <w:rtl w:val="0"/>
+        </w:rPr>
+        <w:t xml:space="preserve"> (BERT) é um modelo de linguagem baseado na arquitetura Transformer desenvolvido para gerar representações contextuais profundas e bidirecionais a partir de grandes volumes de texto não </w:t>
+      </w:r>
+      <w:r>
+        <w:rPr>
+          <w:rtl w:val="0"/>
+        </w:rPr>
+        <w:t xml:space="preserve">rotulado</w:t>
+      </w:r>
+      <w:r>
+        <w:rPr>
+          <w:rtl w:val="0"/>
+        </w:rPr>
+        <w:t xml:space="preserve"> [1]. Diferentemente de modelos anteriores que processavam sequências textuais de forma unidirecional (da direita para a esquerda ou da esquerda para a direita), o BERT foi projetado para aprender representações considerando simultaneamente os contextos à esquerda e à direita de cada palavra em todas as camadas da rede, produzindo representações linguísticas mais contextualizadas [1].</w:t>
+      </w:r>
+    </w:p>
+    <w:p>
+      <w:pPr>
+        <w:rPr/>
+      </w:pPr>
+      <w:r>
+        <w:rPr>
+          <w:rtl w:val="0"/>
+        </w:rPr>
+        <w:t xml:space="preserve">Essa capacidade bidirecional permite que a representação de um termo seja construída a partir de todo o contexto em que ele aparece, produzindo representações linguísticas mais contextualizadas do que aquelas obtidas por embeddings estáticos ou modelos unidirecionais [1,2].</w:t>
+      </w:r>
+    </w:p>
+    <w:p>
+      <w:pPr>
+        <w:rPr/>
+      </w:pPr>
+      <w:r>
+        <w:rPr>
+          <w:rtl w:val="0"/>
+        </w:rPr>
+      </w:r>
+    </w:p>
+    <w:p>
+      <w:pPr>
+        <w:pStyle w:val="Heading3"/>
+        <w:rPr/>
+      </w:pPr>
+      <w:bookmarkStart w:colFirst="0" w:colLast="0" w:name="_604u9n3o06v" w:id="10"/>
+      <w:bookmarkEnd w:id="10"/>
+      <w:r>
+        <w:rPr>
+          <w:rtl w:val="0"/>
+        </w:rPr>
+        <w:t xml:space="preserve">3.6.1 Visão geral da arquitetura</w:t>
+      </w:r>
+    </w:p>
+    <w:p>
+      <w:pPr>
+        <w:rPr/>
+      </w:pPr>
+      <w:r>
+        <w:rPr>
+          <w:rtl w:val="0"/>
+        </w:rPr>
+      </w:r>
+    </w:p>
+    <w:p>
+      <w:pPr>
+        <w:rPr/>
+      </w:pPr>
+      <w:r>
+        <w:rPr>
+          <w:rtl w:val="0"/>
+        </w:rPr>
+        <w:t xml:space="preserve">A arquitetura do BERT é derivada do Transformer proposto por Vaswani et al., utilizando exclusivamente a porção codificadora da arquitetura original [1]. O modelo é composto por múltiplas camadas empilhadas de mecanismos de autoatenção (self-attention) e redes neurais feed-forward, permitindo o processamento paralelo das sequências de entrada e a modelagem de dependências de longo alcance entre os termos do texto [1].</w:t>
+      </w:r>
+    </w:p>
+    <w:p>
+      <w:pPr>
+        <w:rPr/>
+      </w:pPr>
+      <w:r>
+        <w:rPr>
+          <w:rtl w:val="0"/>
+        </w:rPr>
+        <w:t xml:space="preserve">Diferentemente das arquiteturas recorrentes tradicionais, o mecanismo de autoatenção permite que cada token da sequência interaja diretamente com todos os demais tokens durante o processo, o que favorece a construção de representações contextuais ricas [1]. De acordo com Rogers et al. [2], estudos posteriores evidenciaram que diferentes camadas do BERT capturam diferentes tipos de conhecimento linguístico, contribuindo para o desempenho do modelo em tarefas de compreensão de linguagem.</w:t>
+      </w:r>
+    </w:p>
+    <w:p>
+      <w:pPr>
+        <w:rPr/>
+      </w:pPr>
+      <w:r>
+        <w:rPr>
+          <w:rtl w:val="0"/>
+        </w:rPr>
+        <w:t xml:space="preserve">No artigo que apresentou o modelo, os autores especificaram duas configurações principais de tamanho para a sua aplicação: </w:t>
+      </w:r>
+    </w:p>
+    <w:p>
+      <w:pPr>
+        <w:rPr/>
+      </w:pPr>
+      <w:r>
+        <w:rPr>
+          <w:rtl w:val="0"/>
+        </w:rPr>
       </w:r>
     </w:p>
     <w:p>
@@ -2860,8 +2986,8 @@
         <w:pStyle w:val="Subtitle"/>
         <w:rPr/>
       </w:pPr>
-      <w:bookmarkStart w:colFirst="0" w:colLast="0" w:name="_esp1xl3ydlsy" w:id="10"/>
-      <w:bookmarkEnd w:id="10"/>
+      <w:bookmarkStart w:colFirst="0" w:colLast="0" w:name="_esp1xl3ydlsy" w:id="11"/>
+      <w:bookmarkEnd w:id="11"/>
       <w:r>
         <w:rPr>
           <w:rtl w:val="0"/>
@@ -2895,8 +3021,8 @@
         <w:pStyle w:val="Subtitle"/>
         <w:rPr/>
       </w:pPr>
-      <w:bookmarkStart w:colFirst="0" w:colLast="0" w:name="_l2h2uue5zkmi" w:id="11"/>
-      <w:bookmarkEnd w:id="11"/>
+      <w:bookmarkStart w:colFirst="0" w:colLast="0" w:name="_l2h2uue5zkmi" w:id="12"/>
+      <w:bookmarkEnd w:id="12"/>
       <w:r>
         <w:rPr>
           <w:rtl w:val="0"/>
@@ -2928,8 +3054,8 @@
         <w:pStyle w:val="Title"/>
         <w:rPr/>
       </w:pPr>
-      <w:bookmarkStart w:colFirst="0" w:colLast="0" w:name="_qr58d23lut8i" w:id="12"/>
-      <w:bookmarkEnd w:id="12"/>
+      <w:bookmarkStart w:colFirst="0" w:colLast="0" w:name="_qr58d23lut8i" w:id="13"/>
+      <w:bookmarkEnd w:id="13"/>
       <w:r>
         <w:rPr>
           <w:rtl w:val="0"/>
@@ -2952,8 +3078,8 @@
         <w:pStyle w:val="Subtitle"/>
         <w:rPr/>
       </w:pPr>
-      <w:bookmarkStart w:colFirst="0" w:colLast="0" w:name="_6pbcklu290d8" w:id="13"/>
-      <w:bookmarkEnd w:id="13"/>
+      <w:bookmarkStart w:colFirst="0" w:colLast="0" w:name="_6pbcklu290d8" w:id="14"/>
+      <w:bookmarkEnd w:id="14"/>
       <w:r>
         <w:rPr>
           <w:rtl w:val="0"/>
@@ -2998,8 +3124,8 @@
         <w:pStyle w:val="Heading3"/>
         <w:rPr/>
       </w:pPr>
-      <w:bookmarkStart w:colFirst="0" w:colLast="0" w:name="_nxke2ogiu7lp" w:id="14"/>
-      <w:bookmarkEnd w:id="14"/>
+      <w:bookmarkStart w:colFirst="0" w:colLast="0" w:name="_nxke2ogiu7lp" w:id="15"/>
+      <w:bookmarkEnd w:id="15"/>
       <w:r>
         <w:rPr>
           <w:rtl w:val="0"/>
@@ -3278,8 +3404,8 @@
         <w:pStyle w:val="Heading3"/>
         <w:rPr/>
       </w:pPr>
-      <w:bookmarkStart w:colFirst="0" w:colLast="0" w:name="_4olqhs13jcs" w:id="15"/>
-      <w:bookmarkEnd w:id="15"/>
+      <w:bookmarkStart w:colFirst="0" w:colLast="0" w:name="_4olqhs13jcs" w:id="16"/>
+      <w:bookmarkEnd w:id="16"/>
       <w:r>
         <w:rPr>
           <w:rtl w:val="0"/>
@@ -3356,8 +3482,8 @@
         <w:pStyle w:val="Heading3"/>
         <w:rPr/>
       </w:pPr>
-      <w:bookmarkStart w:colFirst="0" w:colLast="0" w:name="_gq5iftmo11gg" w:id="16"/>
-      <w:bookmarkEnd w:id="16"/>
+      <w:bookmarkStart w:colFirst="0" w:colLast="0" w:name="_gq5iftmo11gg" w:id="17"/>
+      <w:bookmarkEnd w:id="17"/>
       <w:r>
         <w:rPr>
           <w:rtl w:val="0"/>
@@ -3923,8 +4049,8 @@
         <w:pStyle w:val="Heading3"/>
         <w:rPr/>
       </w:pPr>
-      <w:bookmarkStart w:colFirst="0" w:colLast="0" w:name="_z3usglqi5uex" w:id="17"/>
-      <w:bookmarkEnd w:id="17"/>
+      <w:bookmarkStart w:colFirst="0" w:colLast="0" w:name="_z3usglqi5uex" w:id="18"/>
+      <w:bookmarkEnd w:id="18"/>
       <w:r>
         <w:rPr>
           <w:rtl w:val="0"/>
@@ -3936,8 +4062,8 @@
         <w:pStyle w:val="Heading3"/>
         <w:rPr/>
       </w:pPr>
-      <w:bookmarkStart w:colFirst="0" w:colLast="0" w:name="_8jgsl88a88b7" w:id="18"/>
-      <w:bookmarkEnd w:id="18"/>
+      <w:bookmarkStart w:colFirst="0" w:colLast="0" w:name="_8jgsl88a88b7" w:id="19"/>
+      <w:bookmarkEnd w:id="19"/>
       <w:r>
         <w:rPr>
           <w:rtl w:val="0"/>
@@ -3949,8 +4075,8 @@
         <w:pStyle w:val="Heading3"/>
         <w:rPr/>
       </w:pPr>
-      <w:bookmarkStart w:colFirst="0" w:colLast="0" w:name="_rk2pdx4noqvo" w:id="19"/>
-      <w:bookmarkEnd w:id="19"/>
+      <w:bookmarkStart w:colFirst="0" w:colLast="0" w:name="_rk2pdx4noqvo" w:id="20"/>
+      <w:bookmarkEnd w:id="20"/>
       <w:r>
         <w:rPr>
           <w:rtl w:val="0"/>
@@ -3962,8 +4088,8 @@
         <w:pStyle w:val="Heading3"/>
         <w:rPr/>
       </w:pPr>
-      <w:bookmarkStart w:colFirst="0" w:colLast="0" w:name="_hycjq0pmvxdy" w:id="20"/>
-      <w:bookmarkEnd w:id="20"/>
+      <w:bookmarkStart w:colFirst="0" w:colLast="0" w:name="_hycjq0pmvxdy" w:id="21"/>
+      <w:bookmarkEnd w:id="21"/>
       <w:r>
         <w:rPr>
           <w:rtl w:val="0"/>
@@ -3975,8 +4101,8 @@
         <w:pStyle w:val="Heading3"/>
         <w:rPr/>
       </w:pPr>
-      <w:bookmarkStart w:colFirst="0" w:colLast="0" w:name="_8r1vlmwupuil" w:id="21"/>
-      <w:bookmarkEnd w:id="21"/>
+      <w:bookmarkStart w:colFirst="0" w:colLast="0" w:name="_8r1vlmwupuil" w:id="22"/>
+      <w:bookmarkEnd w:id="22"/>
       <w:r>
         <w:rPr>
           <w:rtl w:val="0"/>
@@ -3988,8 +4114,8 @@
         <w:pStyle w:val="Heading3"/>
         <w:rPr/>
       </w:pPr>
-      <w:bookmarkStart w:colFirst="0" w:colLast="0" w:name="_bp05maj0far1" w:id="22"/>
-      <w:bookmarkEnd w:id="22"/>
+      <w:bookmarkStart w:colFirst="0" w:colLast="0" w:name="_bp05maj0far1" w:id="23"/>
+      <w:bookmarkEnd w:id="23"/>
       <w:r>
         <w:rPr>
           <w:rtl w:val="0"/>
@@ -4001,8 +4127,8 @@
         <w:pStyle w:val="Heading3"/>
         <w:rPr/>
       </w:pPr>
-      <w:bookmarkStart w:colFirst="0" w:colLast="0" w:name="_dot5rl8p0mqw" w:id="23"/>
-      <w:bookmarkEnd w:id="23"/>
+      <w:bookmarkStart w:colFirst="0" w:colLast="0" w:name="_dot5rl8p0mqw" w:id="24"/>
+      <w:bookmarkEnd w:id="24"/>
       <w:r>
         <w:rPr>
           <w:rtl w:val="0"/>
@@ -4014,8 +4140,8 @@
         <w:pStyle w:val="Heading3"/>
         <w:rPr/>
       </w:pPr>
-      <w:bookmarkStart w:colFirst="0" w:colLast="0" w:name="_35rfydvcbj6e" w:id="24"/>
-      <w:bookmarkEnd w:id="24"/>
+      <w:bookmarkStart w:colFirst="0" w:colLast="0" w:name="_35rfydvcbj6e" w:id="25"/>
+      <w:bookmarkEnd w:id="25"/>
       <w:r>
         <w:rPr>
           <w:rtl w:val="0"/>
@@ -4027,8 +4153,8 @@
         <w:pStyle w:val="Heading3"/>
         <w:rPr/>
       </w:pPr>
-      <w:bookmarkStart w:colFirst="0" w:colLast="0" w:name="_bfm2go8kq3l1" w:id="25"/>
-      <w:bookmarkEnd w:id="25"/>
+      <w:bookmarkStart w:colFirst="0" w:colLast="0" w:name="_bfm2go8kq3l1" w:id="26"/>
+      <w:bookmarkEnd w:id="26"/>
       <w:r>
         <w:rPr>
           <w:rtl w:val="0"/>
@@ -4040,8 +4166,8 @@
         <w:pStyle w:val="Heading3"/>
         <w:rPr/>
       </w:pPr>
-      <w:bookmarkStart w:colFirst="0" w:colLast="0" w:name="_uubzrnxo739c" w:id="26"/>
-      <w:bookmarkEnd w:id="26"/>
+      <w:bookmarkStart w:colFirst="0" w:colLast="0" w:name="_uubzrnxo739c" w:id="27"/>
+      <w:bookmarkEnd w:id="27"/>
       <w:r>
         <w:rPr>
           <w:rtl w:val="0"/>
@@ -4053,8 +4179,8 @@
         <w:pStyle w:val="Heading3"/>
         <w:rPr/>
       </w:pPr>
-      <w:bookmarkStart w:colFirst="0" w:colLast="0" w:name="_1hc93ftduj8u" w:id="27"/>
-      <w:bookmarkEnd w:id="27"/>
+      <w:bookmarkStart w:colFirst="0" w:colLast="0" w:name="_1hc93ftduj8u" w:id="28"/>
+      <w:bookmarkEnd w:id="28"/>
       <w:r>
         <w:rPr>
           <w:rtl w:val="0"/>
@@ -4111,8 +4237,8 @@
         <w:pStyle w:val="Heading3"/>
         <w:rPr/>
       </w:pPr>
-      <w:bookmarkStart w:colFirst="0" w:colLast="0" w:name="_c4wnemnf72ge" w:id="28"/>
-      <w:bookmarkEnd w:id="28"/>
+      <w:bookmarkStart w:colFirst="0" w:colLast="0" w:name="_c4wnemnf72ge" w:id="29"/>
+      <w:bookmarkEnd w:id="29"/>
       <w:r>
         <w:rPr>
           <w:rtl w:val="0"/>
@@ -4124,8 +4250,8 @@
         <w:pStyle w:val="Heading3"/>
         <w:rPr/>
       </w:pPr>
-      <w:bookmarkStart w:colFirst="0" w:colLast="0" w:name="_zfpt9ir4pskd" w:id="29"/>
-      <w:bookmarkEnd w:id="29"/>
+      <w:bookmarkStart w:colFirst="0" w:colLast="0" w:name="_zfpt9ir4pskd" w:id="30"/>
+      <w:bookmarkEnd w:id="30"/>
       <w:r>
         <w:rPr>
           <w:rtl w:val="0"/>
@@ -4169,8 +4295,8 @@
         <w:pStyle w:val="Heading3"/>
         <w:rPr/>
       </w:pPr>
-      <w:bookmarkStart w:colFirst="0" w:colLast="0" w:name="_wtmltat0jxhl" w:id="30"/>
-      <w:bookmarkEnd w:id="30"/>
+      <w:bookmarkStart w:colFirst="0" w:colLast="0" w:name="_wtmltat0jxhl" w:id="31"/>
+      <w:bookmarkEnd w:id="31"/>
       <w:r>
         <w:rPr>
           <w:rtl w:val="0"/>
@@ -4217,8 +4343,8 @@
         <w:pStyle w:val="Subtitle"/>
         <w:rPr/>
       </w:pPr>
-      <w:bookmarkStart w:colFirst="0" w:colLast="0" w:name="_sv3fxrwunlqd" w:id="31"/>
-      <w:bookmarkEnd w:id="31"/>
+      <w:bookmarkStart w:colFirst="0" w:colLast="0" w:name="_sv3fxrwunlqd" w:id="32"/>
+      <w:bookmarkEnd w:id="32"/>
       <w:r>
         <w:rPr>
           <w:rtl w:val="0"/>
@@ -4241,8 +4367,8 @@
         <w:pStyle w:val="Heading3"/>
         <w:rPr/>
       </w:pPr>
-      <w:bookmarkStart w:colFirst="0" w:colLast="0" w:name="_ehdwdzt8gy4l" w:id="32"/>
-      <w:bookmarkEnd w:id="32"/>
+      <w:bookmarkStart w:colFirst="0" w:colLast="0" w:name="_ehdwdzt8gy4l" w:id="33"/>
+      <w:bookmarkEnd w:id="33"/>
       <w:r>
         <w:rPr>
           <w:rtl w:val="0"/>
@@ -4276,8 +4402,8 @@
         <w:pStyle w:val="Heading3"/>
         <w:rPr/>
       </w:pPr>
-      <w:bookmarkStart w:colFirst="0" w:colLast="0" w:name="_jinka7uh0mp" w:id="33"/>
-      <w:bookmarkEnd w:id="33"/>
+      <w:bookmarkStart w:colFirst="0" w:colLast="0" w:name="_jinka7uh0mp" w:id="34"/>
+      <w:bookmarkEnd w:id="34"/>
       <w:r>
         <w:rPr>
           <w:rtl w:val="0"/>
@@ -4311,8 +4437,8 @@
         <w:pStyle w:val="Heading3"/>
         <w:rPr/>
       </w:pPr>
-      <w:bookmarkStart w:colFirst="0" w:colLast="0" w:name="_trwb8gbvnjrt" w:id="34"/>
-      <w:bookmarkEnd w:id="34"/>
+      <w:bookmarkStart w:colFirst="0" w:colLast="0" w:name="_trwb8gbvnjrt" w:id="35"/>
+      <w:bookmarkEnd w:id="35"/>
       <w:r>
         <w:rPr>
           <w:rtl w:val="0"/>
@@ -4346,8 +4472,8 @@
         <w:pStyle w:val="Subtitle"/>
         <w:rPr/>
       </w:pPr>
-      <w:bookmarkStart w:colFirst="0" w:colLast="0" w:name="_tgfdqc79i3o" w:id="35"/>
-      <w:bookmarkEnd w:id="35"/>
+      <w:bookmarkStart w:colFirst="0" w:colLast="0" w:name="_tgfdqc79i3o" w:id="36"/>
+      <w:bookmarkEnd w:id="36"/>
       <w:r>
         <w:rPr>
           <w:rtl w:val="0"/>
@@ -4379,8 +4505,8 @@
         <w:pStyle w:val="Title"/>
         <w:rPr/>
       </w:pPr>
-      <w:bookmarkStart w:colFirst="0" w:colLast="0" w:name="_huwuskfzpzg9" w:id="36"/>
-      <w:bookmarkEnd w:id="36"/>
+      <w:bookmarkStart w:colFirst="0" w:colLast="0" w:name="_huwuskfzpzg9" w:id="37"/>
+      <w:bookmarkEnd w:id="37"/>
       <w:r>
         <w:rPr>
           <w:rtl w:val="0"/>
@@ -4403,8 +4529,8 @@
         <w:pStyle w:val="Subtitle"/>
         <w:rPr/>
       </w:pPr>
-      <w:bookmarkStart w:colFirst="0" w:colLast="0" w:name="_jzjicwgeck2v" w:id="37"/>
-      <w:bookmarkEnd w:id="37"/>
+      <w:bookmarkStart w:colFirst="0" w:colLast="0" w:name="_jzjicwgeck2v" w:id="38"/>
+      <w:bookmarkEnd w:id="38"/>
       <w:r>
         <w:rPr>
           <w:rtl w:val="0"/>
@@ -4438,8 +4564,8 @@
         <w:pStyle w:val="Subtitle"/>
         <w:rPr/>
       </w:pPr>
-      <w:bookmarkStart w:colFirst="0" w:colLast="0" w:name="_wn82ssb74gdk" w:id="38"/>
-      <w:bookmarkEnd w:id="38"/>
+      <w:bookmarkStart w:colFirst="0" w:colLast="0" w:name="_wn82ssb74gdk" w:id="39"/>
+      <w:bookmarkEnd w:id="39"/>
       <w:r>
         <w:rPr>
           <w:rtl w:val="0"/>
@@ -4462,8 +4588,8 @@
         <w:pStyle w:val="Heading3"/>
         <w:rPr/>
       </w:pPr>
-      <w:bookmarkStart w:colFirst="0" w:colLast="0" w:name="_9i2g16r8tj7s" w:id="39"/>
-      <w:bookmarkEnd w:id="39"/>
+      <w:bookmarkStart w:colFirst="0" w:colLast="0" w:name="_9i2g16r8tj7s" w:id="40"/>
+      <w:bookmarkEnd w:id="40"/>
       <w:r>
         <w:rPr>
           <w:rtl w:val="0"/>
@@ -4497,8 +4623,8 @@
         <w:pStyle w:val="Heading3"/>
         <w:rPr/>
       </w:pPr>
-      <w:bookmarkStart w:colFirst="0" w:colLast="0" w:name="_cdohbypo7a76" w:id="40"/>
-      <w:bookmarkEnd w:id="40"/>
+      <w:bookmarkStart w:colFirst="0" w:colLast="0" w:name="_cdohbypo7a76" w:id="41"/>
+      <w:bookmarkEnd w:id="41"/>
       <w:r>
         <w:rPr>
           <w:rtl w:val="0"/>
@@ -4532,8 +4658,8 @@
         <w:pStyle w:val="Heading3"/>
         <w:rPr/>
       </w:pPr>
-      <w:bookmarkStart w:colFirst="0" w:colLast="0" w:name="_yns5rzybghog" w:id="41"/>
-      <w:bookmarkEnd w:id="41"/>
+      <w:bookmarkStart w:colFirst="0" w:colLast="0" w:name="_yns5rzybghog" w:id="42"/>
+      <w:bookmarkEnd w:id="42"/>
       <w:r>
         <w:rPr>
           <w:rtl w:val="0"/>
@@ -4567,8 +4693,8 @@
         <w:pStyle w:val="Subtitle"/>
         <w:rPr/>
       </w:pPr>
-      <w:bookmarkStart w:colFirst="0" w:colLast="0" w:name="_j0i5eueol7kr" w:id="42"/>
-      <w:bookmarkEnd w:id="42"/>
+      <w:bookmarkStart w:colFirst="0" w:colLast="0" w:name="_j0i5eueol7kr" w:id="43"/>
+      <w:bookmarkEnd w:id="43"/>
       <w:r>
         <w:rPr>
           <w:rtl w:val="0"/>
@@ -4602,8 +4728,8 @@
         <w:pStyle w:val="Subtitle"/>
         <w:rPr/>
       </w:pPr>
-      <w:bookmarkStart w:colFirst="0" w:colLast="0" w:name="_y2xow5h0apl" w:id="43"/>
-      <w:bookmarkEnd w:id="43"/>
+      <w:bookmarkStart w:colFirst="0" w:colLast="0" w:name="_y2xow5h0apl" w:id="44"/>
+      <w:bookmarkEnd w:id="44"/>
       <w:r>
         <w:rPr>
           <w:rtl w:val="0"/>
@@ -4633,8 +4759,8 @@
         <w:pStyle w:val="Title"/>
         <w:rPr/>
       </w:pPr>
-      <w:bookmarkStart w:colFirst="0" w:colLast="0" w:name="_n5boaojb6c4e" w:id="44"/>
-      <w:bookmarkEnd w:id="44"/>
+      <w:bookmarkStart w:colFirst="0" w:colLast="0" w:name="_n5boaojb6c4e" w:id="45"/>
+      <w:bookmarkEnd w:id="45"/>
       <w:r>
         <w:rPr>
           <w:rtl w:val="0"/>
@@ -4961,24 +5087,84 @@
       <w:pPr>
         <w:spacing w:after="240" w:before="240" w:line="259" w:lineRule="auto"/>
         <w:rPr>
-          <w:sz w:val="28"/>
-          <w:szCs w:val="28"/>
-        </w:rPr>
-      </w:pPr>
-      <w:r>
-        <w:rPr>
           <w:sz w:val="22"/>
           <w:szCs w:val="22"/>
+        </w:rPr>
+      </w:pPr>
+      <w:r>
+        <w:rPr>
+          <w:sz w:val="22"/>
+          <w:szCs w:val="22"/>
           <w:rtl w:val="0"/>
         </w:rPr>
         <w:t xml:space="preserve">[17] PANOPLY. Twitter Data Dictionary. 2021. Disponível em: https://panoply-documentation.</w:t>
         <w:br w:type="textWrapping"/>
-        <w:t xml:space="preserve">document360.io/docs/data-dictionary-twitter. Acesso em: 21 abr. 2026</w:t>
-      </w:r>
-      <w:r>
-        <w:rPr>
-          <w:rtl w:val="0"/>
-        </w:rPr>
+        <w:t xml:space="preserve">document360.io/docs/data-dictionary-twitter. Acesso em: 21 abr. 2026.</w:t>
+      </w:r>
+    </w:p>
+    <w:p>
+      <w:pPr>
+        <w:spacing w:after="240" w:before="240" w:line="259" w:lineRule="auto"/>
+        <w:rPr>
+          <w:sz w:val="22"/>
+          <w:szCs w:val="22"/>
+        </w:rPr>
+      </w:pPr>
+      <w:r>
+        <w:rPr>
+          <w:rtl w:val="0"/>
+        </w:rPr>
+      </w:r>
+    </w:p>
+    <w:p>
+      <w:pPr>
+        <w:spacing w:after="240" w:before="240" w:line="259" w:lineRule="auto"/>
+        <w:rPr>
+          <w:sz w:val="22"/>
+          <w:szCs w:val="22"/>
+        </w:rPr>
+      </w:pPr>
+      <w:r>
+        <w:rPr>
+          <w:rtl w:val="0"/>
+        </w:rPr>
+      </w:r>
+    </w:p>
+    <w:p>
+      <w:pPr>
+        <w:spacing w:after="240" w:before="240" w:line="259" w:lineRule="auto"/>
+        <w:rPr>
+          <w:sz w:val="22"/>
+          <w:szCs w:val="22"/>
+        </w:rPr>
+      </w:pPr>
+      <w:r>
+        <w:rPr>
+          <w:sz w:val="22"/>
+          <w:szCs w:val="22"/>
+          <w:rtl w:val="0"/>
+        </w:rPr>
+        <w:t xml:space="preserve">Referencias BERT:</w:t>
+        <w:br w:type="textWrapping"/>
+        <w:t xml:space="preserve">[1] Devlin J, Chang MW, Lee K, Toutanova K. BERT: Pre-training of deep bidirectional transformers for language understanding. In: Proceedings of the 2019 Conference of the North American Chapter of the Association for Computational Linguistics: Human Language Technologies, Volume 1 (Long and Short Papers). Minneapolis: Association for Computational Linguistics; 2019. p. 4171-4186.</w:t>
+      </w:r>
+    </w:p>
+    <w:p>
+      <w:pPr>
+        <w:spacing w:after="240" w:before="240" w:line="259" w:lineRule="auto"/>
+        <w:ind w:left="0" w:firstLine="0"/>
+        <w:rPr>
+          <w:sz w:val="22"/>
+          <w:szCs w:val="22"/>
+        </w:rPr>
+      </w:pPr>
+      <w:r>
+        <w:rPr>
+          <w:sz w:val="22"/>
+          <w:szCs w:val="22"/>
+          <w:rtl w:val="0"/>
+        </w:rPr>
+        <w:t xml:space="preserve">[2] Rogers A, Kovaleva O, Rumshisky A. A primer on BERTology: What what we know about how BERT works. Transactions of the Association for Computational Linguistics. 2020;8:842-866. doi:10.1162/tacl_a_00349.</w:t>
       </w:r>
     </w:p>
     <w:sectPr>

</xml_diff>

<commit_message>
Updated Relatorio_PGC and Model
</commit_message>
<xml_diff>
--- a/docs/PGC_ANALISE_DE_CONFLITOS_EM_REDES_SOCIAIS.docx
+++ b/docs/PGC_ANALISE_DE_CONFLITOS_EM_REDES_SOCIAIS.docx
@@ -2396,7 +2396,7 @@
       <w:pPr>
         <w:numPr>
           <w:ilvl w:val="0"/>
-          <w:numId w:val="1"/>
+          <w:numId w:val="3"/>
         </w:numPr>
         <w:ind w:left="720" w:hanging="360"/>
         <w:rPr>
@@ -2408,6 +2408,583 @@
           <w:rtl w:val="0"/>
         </w:rPr>
         <w:t xml:space="preserve">Discutir, propor e selecionar técnicas que caracterizem a existência de conflitos em posts em redes sociais;</w:t>
+      </w:r>
+    </w:p>
+    <w:p>
+      <w:pPr>
+        <w:numPr>
+          <w:ilvl w:val="0"/>
+          <w:numId w:val="3"/>
+        </w:numPr>
+        <w:ind w:left="720" w:hanging="360"/>
+        <w:rPr>
+          <w:u w:val="none"/>
+        </w:rPr>
+      </w:pPr>
+      <w:r>
+        <w:rPr>
+          <w:rtl w:val="0"/>
+        </w:rPr>
+        <w:t xml:space="preserve">Construir um Dataset classificando conflitos em pares de textos</w:t>
+      </w:r>
+    </w:p>
+    <w:p>
+      <w:pPr>
+        <w:numPr>
+          <w:ilvl w:val="0"/>
+          <w:numId w:val="3"/>
+        </w:numPr>
+        <w:ind w:left="720" w:hanging="360"/>
+        <w:rPr>
+          <w:u w:val="none"/>
+        </w:rPr>
+      </w:pPr>
+      <w:r>
+        <w:rPr>
+          <w:rtl w:val="0"/>
+        </w:rPr>
+        <w:t xml:space="preserve">Selecionar e treinar um modelo de IA apropriado para as técnicas selecionadas;</w:t>
+      </w:r>
+    </w:p>
+    <w:p>
+      <w:pPr>
+        <w:numPr>
+          <w:ilvl w:val="0"/>
+          <w:numId w:val="3"/>
+        </w:numPr>
+        <w:ind w:left="720" w:hanging="360"/>
+        <w:rPr>
+          <w:u w:val="none"/>
+        </w:rPr>
+      </w:pPr>
+      <w:r>
+        <w:rPr>
+          <w:rtl w:val="0"/>
+        </w:rPr>
+        <w:t xml:space="preserve">Analisar o desempenho e eficiência do modelo;</w:t>
+      </w:r>
+    </w:p>
+    <w:p>
+      <w:pPr>
+        <w:numPr>
+          <w:ilvl w:val="0"/>
+          <w:numId w:val="3"/>
+        </w:numPr>
+        <w:ind w:left="720" w:hanging="360"/>
+        <w:rPr>
+          <w:u w:val="none"/>
+        </w:rPr>
+      </w:pPr>
+      <w:r>
+        <w:rPr>
+          <w:rtl w:val="0"/>
+        </w:rPr>
+        <w:t xml:space="preserve">Formalizar uma biblioteca de software para o modelo;</w:t>
+      </w:r>
+      <w:r>
+        <w:br w:type="page"/>
+      </w:r>
+      <w:r>
+        <w:rPr>
+          <w:rtl w:val="0"/>
+        </w:rPr>
+      </w:r>
+    </w:p>
+    <w:p>
+      <w:pPr>
+        <w:pStyle w:val="Title"/>
+        <w:ind w:left="0" w:firstLine="0"/>
+        <w:rPr/>
+      </w:pPr>
+      <w:bookmarkStart w:colFirst="0" w:colLast="0" w:name="_i38tyx7t832k" w:id="2"/>
+      <w:bookmarkEnd w:id="2"/>
+      <w:r>
+        <w:rPr>
+          <w:rtl w:val="0"/>
+        </w:rPr>
+        <w:t xml:space="preserve">3 FUNDAMENTAÇÃO TEÓRICA</w:t>
+      </w:r>
+    </w:p>
+    <w:p>
+      <w:pPr>
+        <w:rPr/>
+      </w:pPr>
+      <w:r>
+        <w:rPr>
+          <w:rtl w:val="0"/>
+        </w:rPr>
+      </w:r>
+    </w:p>
+    <w:p>
+      <w:pPr>
+        <w:pStyle w:val="Subtitle"/>
+        <w:rPr/>
+      </w:pPr>
+      <w:bookmarkStart w:colFirst="0" w:colLast="0" w:name="_ul0vtgdmhavx" w:id="3"/>
+      <w:bookmarkEnd w:id="3"/>
+      <w:r>
+        <w:rPr>
+          <w:rtl w:val="0"/>
+        </w:rPr>
+        <w:t xml:space="preserve">3.1 Redes sociais e interações digitais</w:t>
+      </w:r>
+    </w:p>
+    <w:p>
+      <w:pPr>
+        <w:rPr/>
+      </w:pPr>
+      <w:r>
+        <w:rPr>
+          <w:rtl w:val="0"/>
+        </w:rPr>
+      </w:r>
+    </w:p>
+    <w:p>
+      <w:pPr>
+        <w:rPr/>
+      </w:pPr>
+      <w:r>
+        <w:rPr>
+          <w:rtl w:val="0"/>
+        </w:rPr>
+        <w:t xml:space="preserve">Sugestão: Contextualizar redes sociais, desde advento, popularização, modelo de interação (ex: ambiente flexível sem precisar ter contato real, e sem dependência temporal), discussões públicas e etc.</w:t>
+      </w:r>
+    </w:p>
+    <w:p>
+      <w:pPr>
+        <w:rPr/>
+      </w:pPr>
+      <w:r>
+        <w:rPr>
+          <w:rtl w:val="0"/>
+        </w:rPr>
+      </w:r>
+    </w:p>
+    <w:p>
+      <w:pPr>
+        <w:pStyle w:val="Subtitle"/>
+        <w:rPr/>
+      </w:pPr>
+      <w:bookmarkStart w:colFirst="0" w:colLast="0" w:name="_dpbnoeom4bh7" w:id="4"/>
+      <w:bookmarkEnd w:id="4"/>
+      <w:r>
+        <w:rPr>
+          <w:rtl w:val="0"/>
+        </w:rPr>
+        <w:t xml:space="preserve">3.2 Conflitos em interações textuais</w:t>
+      </w:r>
+    </w:p>
+    <w:p>
+      <w:pPr>
+        <w:rPr/>
+      </w:pPr>
+      <w:r>
+        <w:rPr>
+          <w:rtl w:val="0"/>
+        </w:rPr>
+      </w:r>
+    </w:p>
+    <w:p>
+      <w:pPr>
+        <w:rPr/>
+      </w:pPr>
+      <w:r>
+        <w:rPr>
+          <w:rtl w:val="0"/>
+        </w:rPr>
+        <w:t xml:space="preserve">A busca por uma definição de conflito trata-se de um desafio recorrente na literatura, não havendo um consenso universal sobre o seu significado. Segundo Lyamouri-Bajja et al. (2012), o conceito de conflito tem sido abordado sob diferentes perspectivas ao longo do tempo, variando em função do contexto histórico e social em que é analisado. Ainda segundo os autores, algumas definições concentram-se nas causas do conflito, como disputas por poder, divergências de valores ou fatores emocionais, enquanto outras focam na natureza dos atores envolvidos, sejam indivíduos, grupos ou organizações. Essa diversidade de abordagens deixa claro que o conflito não é um fenômeno unidimensional, mas sim um conceito que depende do contexto em que é analisado. Nesse sentido faz-se necessário uma operacionalização de sua definição a partir de recortes específicos, visando adaptar-se aos objetivos e ao domínio de aplicação do estudo.</w:t>
+      </w:r>
+    </w:p>
+    <w:p>
+      <w:pPr>
+        <w:rPr/>
+      </w:pPr>
+      <w:r>
+        <w:rPr>
+          <w:rtl w:val="0"/>
+        </w:rPr>
+        <w:t xml:space="preserve">No contexto de mídias sociais, essa necessidade se intensifica, dado a natureza dinâmica e linguagem característica dessas interações. Warke et. al. (2025), em um estudo com objetivos semelhantes ao do presente projeto, apontam que a abordagem predominante na detecção de conflito em textos tende a se concentrar na identificação de manifestações explicitamente antagônicas em interações adversas, isto é, situações em que há oposição clara entre os participantes. No entanto, o mesmo estudo propõe uma visão mais abrangente do fenômeno buscando capturar o espectro do conflito. Nessa abordagem, os autores se baseiam em um estudo de análise de caráter netnográfico sobre interações em plataformas sociais, no qual são identificados diferentes categorias associadas ao conflito, são elas: provocação, crítica, sarcasmo, trolling, assédio e ameaças. Essa abordagem garante uma detecção mais granular do conflito, consoante aos objetivos propostos no trabalho dos autores.</w:t>
+      </w:r>
+    </w:p>
+    <w:p>
+      <w:pPr>
+        <w:rPr/>
+      </w:pPr>
+      <w:r>
+        <w:rPr>
+          <w:rtl w:val="0"/>
+        </w:rPr>
+        <w:t xml:space="preserve">A partir dessas considerações, adota-se, neste trabalho, uma definição operacional de conflito voltada ao contexto de mídias sociais. Desta forma, considera-se que:</w:t>
+      </w:r>
+    </w:p>
+    <w:p>
+      <w:pPr>
+        <w:ind w:left="1133.858267716535" w:firstLine="0"/>
+        <w:rPr/>
+      </w:pPr>
+      <w:r>
+        <w:rPr>
+          <w:rtl w:val="0"/>
+        </w:rPr>
+        <w:t xml:space="preserve">Conflito consiste em manifestações abertamente antagônicas de interações adversas, incluindo formas implícitas (Provocação, crítica e sarcasmo) e explícitas (Assédio e ameaças), conforme tipologia derivada de estudo netnográfico.</w:t>
+      </w:r>
+    </w:p>
+    <w:p>
+      <w:pPr>
+        <w:rPr/>
+      </w:pPr>
+      <w:r>
+        <w:rPr>
+          <w:rtl w:val="0"/>
+        </w:rPr>
+        <w:t xml:space="preserve">Essa definição permite capturar não apenas conflitos explícitos, mas também formas sutis de antagonismo, sendo adequada ao objetivo deste trabalho de analisar relações discursivas entre pares de tweets.</w:t>
+      </w:r>
+    </w:p>
+    <w:p>
+      <w:pPr>
+        <w:rPr/>
+      </w:pPr>
+      <w:r>
+        <w:rPr>
+          <w:rtl w:val="0"/>
+        </w:rPr>
+      </w:r>
+    </w:p>
+    <w:p>
+      <w:pPr>
+        <w:pStyle w:val="Subtitle"/>
+        <w:rPr/>
+      </w:pPr>
+      <w:bookmarkStart w:colFirst="0" w:colLast="0" w:name="_x9pblf985rjg" w:id="5"/>
+      <w:bookmarkEnd w:id="5"/>
+      <w:r>
+        <w:rPr>
+          <w:rtl w:val="0"/>
+        </w:rPr>
+        <w:t xml:space="preserve">3.3 Processamento de Linguagem Natural </w:t>
+      </w:r>
+    </w:p>
+    <w:p>
+      <w:pPr>
+        <w:rPr/>
+      </w:pPr>
+      <w:r>
+        <w:rPr>
+          <w:rtl w:val="0"/>
+        </w:rPr>
+      </w:r>
+    </w:p>
+    <w:p>
+      <w:pPr>
+        <w:rPr/>
+      </w:pPr>
+      <w:r>
+        <w:rPr>
+          <w:rtl w:val="0"/>
+        </w:rPr>
+        <w:t xml:space="preserve">Introduzir o que é um PLN, suas tarefas, classificações em textos, NLP em redes sociais e desafios em operacionalizar tarefas de PLN em linguagens informais</w:t>
+      </w:r>
+    </w:p>
+    <w:p>
+      <w:pPr>
+        <w:rPr/>
+      </w:pPr>
+      <w:r>
+        <w:rPr>
+          <w:rtl w:val="0"/>
+        </w:rPr>
+      </w:r>
+    </w:p>
+    <w:p>
+      <w:pPr>
+        <w:rPr/>
+      </w:pPr>
+      <w:r>
+        <w:rPr>
+          <w:rtl w:val="0"/>
+        </w:rPr>
+      </w:r>
+    </w:p>
+    <w:p>
+      <w:pPr>
+        <w:pStyle w:val="Subtitle"/>
+        <w:rPr/>
+      </w:pPr>
+      <w:bookmarkStart w:colFirst="0" w:colLast="0" w:name="_kgsb936sst66" w:id="6"/>
+      <w:bookmarkEnd w:id="6"/>
+      <w:r>
+        <w:rPr>
+          <w:rtl w:val="0"/>
+        </w:rPr>
+        <w:t xml:space="preserve">3.4 Aprendizado de máquina e aprendizado profundo</w:t>
+      </w:r>
+    </w:p>
+    <w:p>
+      <w:pPr>
+        <w:rPr/>
+      </w:pPr>
+      <w:r>
+        <w:rPr>
+          <w:rtl w:val="0"/>
+        </w:rPr>
+      </w:r>
+    </w:p>
+    <w:p>
+      <w:pPr>
+        <w:rPr/>
+      </w:pPr>
+      <w:r>
+        <w:rPr>
+          <w:rtl w:val="0"/>
+        </w:rPr>
+        <w:t xml:space="preserve">Introduzir o conceito de ML supervisionado, a representação vetorial de texto, o aprendizado profundo aplicado a PLN, aprendizado por transferencia</w:t>
+      </w:r>
+    </w:p>
+    <w:p>
+      <w:pPr>
+        <w:rPr/>
+      </w:pPr>
+      <w:r>
+        <w:rPr>
+          <w:rtl w:val="0"/>
+        </w:rPr>
+      </w:r>
+    </w:p>
+    <w:p>
+      <w:pPr>
+        <w:pStyle w:val="Subtitle"/>
+        <w:rPr/>
+      </w:pPr>
+      <w:bookmarkStart w:colFirst="0" w:colLast="0" w:name="_4682ybnys95e" w:id="7"/>
+      <w:bookmarkEnd w:id="7"/>
+      <w:r>
+        <w:rPr>
+          <w:rtl w:val="0"/>
+        </w:rPr>
+        <w:t xml:space="preserve">3.5 Transformers</w:t>
+      </w:r>
+    </w:p>
+    <w:p>
+      <w:pPr>
+        <w:rPr/>
+      </w:pPr>
+      <w:r>
+        <w:rPr>
+          <w:rtl w:val="0"/>
+        </w:rPr>
+        <w:t xml:space="preserve">Introduzir o conceito de transformers, tarefa, exemplos</w:t>
+      </w:r>
+    </w:p>
+    <w:p>
+      <w:pPr>
+        <w:rPr/>
+      </w:pPr>
+      <w:r>
+        <w:rPr>
+          <w:rtl w:val="0"/>
+        </w:rPr>
+      </w:r>
+    </w:p>
+    <w:p>
+      <w:pPr>
+        <w:pStyle w:val="Heading3"/>
+        <w:rPr/>
+      </w:pPr>
+      <w:bookmarkStart w:colFirst="0" w:colLast="0" w:name="_qptpnjwe7y1q" w:id="8"/>
+      <w:bookmarkEnd w:id="8"/>
+      <w:r>
+        <w:rPr>
+          <w:rtl w:val="0"/>
+        </w:rPr>
+        <w:t xml:space="preserve">3.5.1 Arquitetura Transformer</w:t>
+      </w:r>
+    </w:p>
+    <w:p>
+      <w:pPr>
+        <w:rPr/>
+      </w:pPr>
+      <w:r>
+        <w:rPr>
+          <w:rtl w:val="0"/>
+        </w:rPr>
+        <w:t xml:space="preserve">Introduzir, sem tamanha formalidade matemática, a arquitetura de um transformer, dando noção sobre attention, embeddings, contexto bidirecional.</w:t>
+      </w:r>
+    </w:p>
+    <w:p>
+      <w:pPr>
+        <w:rPr/>
+      </w:pPr>
+      <w:r>
+        <w:rPr>
+          <w:rtl w:val="0"/>
+        </w:rPr>
+      </w:r>
+    </w:p>
+    <w:p>
+      <w:pPr>
+        <w:pStyle w:val="Subtitle"/>
+        <w:rPr/>
+      </w:pPr>
+      <w:bookmarkStart w:colFirst="0" w:colLast="0" w:name="_kpxa1gq0f13a" w:id="9"/>
+      <w:bookmarkEnd w:id="9"/>
+      <w:r>
+        <w:rPr>
+          <w:rtl w:val="0"/>
+        </w:rPr>
+        <w:t xml:space="preserve">3.6 Arquitetura BERT</w:t>
+      </w:r>
+    </w:p>
+    <w:p>
+      <w:pPr>
+        <w:rPr>
+          <w:highlight w:val="yellow"/>
+        </w:rPr>
+      </w:pPr>
+      <w:r>
+        <w:rPr>
+          <w:rtl w:val="0"/>
+        </w:rPr>
+      </w:r>
+    </w:p>
+    <w:p>
+      <w:pPr>
+        <w:rPr/>
+      </w:pPr>
+      <w:r>
+        <w:rPr>
+          <w:rtl w:val="0"/>
+        </w:rPr>
+        <w:t xml:space="preserve">O </w:t>
+      </w:r>
+      <w:r>
+        <w:rPr>
+          <w:i w:val="1"/>
+          <w:iCs w:val="1"/>
+          <w:rtl w:val="0"/>
+        </w:rPr>
+        <w:t xml:space="preserve">Bidirectional Encoder Representations from Transformers</w:t>
+      </w:r>
+      <w:r>
+        <w:rPr>
+          <w:rtl w:val="0"/>
+        </w:rPr>
+        <w:t xml:space="preserve"> (BERT) é um modelo de linguagem baseado na arquitetura Transformer desenvolvido para gerar representações contextuais profundas e bidirecionais a partir de grandes volumes de texto não </w:t>
+      </w:r>
+      <w:r>
+        <w:rPr>
+          <w:rtl w:val="0"/>
+        </w:rPr>
+        <w:t xml:space="preserve">rotulado</w:t>
+      </w:r>
+      <w:r>
+        <w:rPr>
+          <w:rtl w:val="0"/>
+        </w:rPr>
+        <w:t xml:space="preserve"> [1]. Diferentemente de modelos anteriores que processavam sequências textuais de forma unidirecional (da direita para a esquerda ou da esquerda para a direita), o BERT foi projetado para aprender representações considerando simultaneamente os contextos à esquerda e à direita de cada palavra em todas as camadas da rede [1]. </w:t>
+      </w:r>
+    </w:p>
+    <w:p>
+      <w:pPr>
+        <w:rPr/>
+      </w:pPr>
+      <w:r>
+        <w:rPr>
+          <w:rtl w:val="0"/>
+        </w:rPr>
+        <w:t xml:space="preserve">A abordagem bidirecional oferecida pelo BERT permite que a representação de um termo seja construída a partir de todo o contexto em que ele aparece, produzindo representações linguísticas mais contextualizadas do que aquelas obtidas por embeddings estáticos ou modelos unidirecionais [1,2]. Como resultado, o modelo pode ser pré-treinado em grandes corpora textuais e posteriormente adaptado para diferentes tarefas de Processamento de Linguagem Natural por meio de um processo de ajuste fino (fine-tuning) [1].</w:t>
+      </w:r>
+    </w:p>
+    <w:p>
+      <w:pPr>
+        <w:rPr/>
+      </w:pPr>
+      <w:r>
+        <w:rPr>
+          <w:rtl w:val="0"/>
+        </w:rPr>
+        <w:t xml:space="preserve">As principais características estruturais do modelo são detalhadas nas subseções seguintes.</w:t>
+      </w:r>
+    </w:p>
+    <w:p>
+      <w:pPr>
+        <w:rPr/>
+      </w:pPr>
+      <w:r>
+        <w:rPr>
+          <w:rtl w:val="0"/>
+        </w:rPr>
+      </w:r>
+    </w:p>
+    <w:p>
+      <w:pPr>
+        <w:pStyle w:val="Heading3"/>
+        <w:rPr/>
+      </w:pPr>
+      <w:bookmarkStart w:colFirst="0" w:colLast="0" w:name="_604u9n3o06v" w:id="10"/>
+      <w:bookmarkEnd w:id="10"/>
+      <w:r>
+        <w:rPr>
+          <w:rtl w:val="0"/>
+        </w:rPr>
+        <w:t xml:space="preserve">3.6.1 Visão geral da estrutura</w:t>
+      </w:r>
+    </w:p>
+    <w:p>
+      <w:pPr>
+        <w:ind w:left="0" w:firstLine="720"/>
+        <w:rPr/>
+      </w:pPr>
+      <w:r>
+        <w:rPr>
+          <w:rtl w:val="0"/>
+        </w:rPr>
+      </w:r>
+    </w:p>
+    <w:p>
+      <w:pPr>
+        <w:ind w:left="0" w:firstLine="720"/>
+        <w:rPr/>
+      </w:pPr>
+      <w:r>
+        <w:rPr>
+          <w:rtl w:val="0"/>
+        </w:rPr>
+        <w:t xml:space="preserve">A estrutura interna do BERT é baseada na arquitetura Transformer proposta por Vaswani et al. (2017), utilizando exclusivamente a porção codificadora (Encoder) da arquitetura original [1]. O modelo é formado por diversas camadas empilhadas, cada uma composta por mecanismos de autoatenção (self-attention) e redes neurais feed-forward. Essas camadas trabalham em conjunto para construir representações contextuais cada vez mais ricas dos textos de entrada. [1].</w:t>
+      </w:r>
+    </w:p>
+    <w:p>
+      <w:pPr>
+        <w:ind w:left="0" w:firstLine="720"/>
+        <w:rPr/>
+      </w:pPr>
+      <w:r>
+        <w:rPr>
+          <w:rtl w:val="0"/>
+        </w:rPr>
+        <w:t xml:space="preserve">Por meio do mecanismo de autoatenção, a representação de cada token é calculada com base nos demais tokens da sequência, permitindo a captura de relações contextuais entre palavras independentemente de sua distância no texto [1]. Além disso, a arquitetura possibilita o processamento paralelo das entradas, diferentemente das abordagens recorrentes tradicionalmente utilizadas em tarefas de Processamento de Linguagem Natural [1].</w:t>
+      </w:r>
+    </w:p>
+    <w:p>
+      <w:pPr>
+        <w:ind w:left="0" w:firstLine="720"/>
+        <w:rPr/>
+      </w:pPr>
+      <w:r>
+        <w:rPr>
+          <w:rtl w:val="0"/>
+        </w:rPr>
+        <w:t xml:space="preserve">No artigo que apresentou o modelo, Devlin et al. [1] especificaram duas configurações principais para sua aplicação:</w:t>
+      </w:r>
+    </w:p>
+    <w:p>
+      <w:pPr>
+        <w:ind w:left="0" w:firstLine="720"/>
+        <w:rPr/>
+      </w:pPr>
+      <w:r>
+        <w:rPr>
+          <w:rtl w:val="0"/>
+        </w:rPr>
       </w:r>
     </w:p>
     <w:p>
@@ -2416,7 +2993,7 @@
           <w:ilvl w:val="0"/>
           <w:numId w:val="1"/>
         </w:numPr>
-        <w:ind w:left="720" w:hanging="360"/>
+        <w:ind w:left="1440" w:hanging="360"/>
         <w:rPr>
           <w:u w:val="none"/>
         </w:rPr>
@@ -2425,7 +3002,7 @@
         <w:rPr>
           <w:rtl w:val="0"/>
         </w:rPr>
-        <w:t xml:space="preserve">Construir um Dataset classificando conflitos em pares de textos</w:t>
+        <w:t xml:space="preserve">BERT Base: possui 12 camadas de codificadores (L=12), dimensão oculta de 768 unidades (H=768) e 12 cabeças de atenção (A=12), totalizando aproximadamente 110 milhões de parâmetros.</w:t>
       </w:r>
     </w:p>
     <w:p>
@@ -2434,7 +3011,7 @@
           <w:ilvl w:val="0"/>
           <w:numId w:val="1"/>
         </w:numPr>
-        <w:ind w:left="720" w:hanging="360"/>
+        <w:ind w:left="1440" w:hanging="360"/>
         <w:rPr>
           <w:u w:val="none"/>
         </w:rPr>
@@ -2443,16 +3020,100 @@
         <w:rPr>
           <w:rtl w:val="0"/>
         </w:rPr>
-        <w:t xml:space="preserve">Selecionar e treinar um modelo de IA apropriado para as técnicas selecionadas;</w:t>
+        <w:t xml:space="preserve">BERT Large: possui 24 camadas de codificadores (L=24), dimensão oculta de 1024 unidades (H=1024) e 16 cabeças de atenção (A=16), totalizando aproximadamente 340 milhões de parâmetros.</w:t>
+      </w:r>
+    </w:p>
+    <w:p>
+      <w:pPr>
+        <w:ind w:left="0" w:firstLine="720"/>
+        <w:rPr/>
+      </w:pPr>
+      <w:r>
+        <w:rPr>
+          <w:rtl w:val="0"/>
+        </w:rPr>
+      </w:r>
+    </w:p>
+    <w:p>
+      <w:pPr>
+        <w:ind w:left="0" w:firstLine="720"/>
+        <w:rPr/>
+      </w:pPr>
+      <w:r>
+        <w:rPr>
+          <w:rtl w:val="0"/>
+        </w:rPr>
+        <w:t xml:space="preserve">Segundo Devlin et al. [1], a configuração BERT Base foi definida de forma comparável ao modelo OpenAI GPT, enquanto a configuração BERT Large foi desenvolvida com uma quantidade substancialmente maior de parâmetros. Nos experimentos apresentados pelos autores, o BERT Large obteve desempenho superior ao BERT Base em diversas tarefas de Processamento de Linguagem Natural avaliadas.</w:t>
+      </w:r>
+    </w:p>
+    <w:p>
+      <w:pPr>
+        <w:pStyle w:val="Heading3"/>
+        <w:rPr/>
+      </w:pPr>
+      <w:bookmarkStart w:colFirst="0" w:colLast="0" w:name="_7ttoyllpm2ac" w:id="11"/>
+      <w:bookmarkEnd w:id="11"/>
+      <w:r>
+        <w:rPr>
+          <w:rtl w:val="0"/>
+        </w:rPr>
+      </w:r>
+    </w:p>
+    <w:p>
+      <w:pPr>
+        <w:pStyle w:val="Heading3"/>
+        <w:rPr/>
+      </w:pPr>
+      <w:bookmarkStart w:colFirst="0" w:colLast="0" w:name="_7ums2ys6pdc7" w:id="12"/>
+      <w:bookmarkEnd w:id="12"/>
+      <w:r>
+        <w:rPr>
+          <w:rtl w:val="0"/>
+        </w:rPr>
+        <w:t xml:space="preserve">3.6.2 Representação da entrada (input embeddings)</w:t>
+      </w:r>
+    </w:p>
+    <w:p>
+      <w:pPr>
+        <w:ind w:firstLine="720"/>
+        <w:rPr/>
+      </w:pPr>
+      <w:r>
+        <w:rPr>
+          <w:rtl w:val="0"/>
+        </w:rPr>
+      </w:r>
+    </w:p>
+    <w:p>
+      <w:pPr>
+        <w:ind w:firstLine="720"/>
+        <w:rPr/>
+      </w:pPr>
+      <w:r>
+        <w:rPr>
+          <w:rtl w:val="0"/>
+        </w:rPr>
+        <w:t xml:space="preserve">Antes de ser processado pelo modelo, o texto de entrada é convertido em uma sequência de tokens. O BERT possui uma representação de entrada flexível, capaz de receber tanto uma única sentença quanto um par de sentenças em uma mesma sequência de entrada [1]. Para isso, a representação de entrada é composta formalmente por três tipos distintos de embeddings [1]:</w:t>
+      </w:r>
+    </w:p>
+    <w:p>
+      <w:pPr>
+        <w:ind w:firstLine="720"/>
+        <w:rPr/>
+      </w:pPr>
+      <w:r>
+        <w:rPr>
+          <w:rtl w:val="0"/>
+        </w:rPr>
       </w:r>
     </w:p>
     <w:p>
       <w:pPr>
         <w:numPr>
           <w:ilvl w:val="0"/>
-          <w:numId w:val="1"/>
+          <w:numId w:val="2"/>
         </w:numPr>
-        <w:ind w:left="720" w:hanging="360"/>
+        <w:ind w:left="1440" w:hanging="360"/>
         <w:rPr>
           <w:u w:val="none"/>
         </w:rPr>
@@ -2461,16 +3122,16 @@
         <w:rPr>
           <w:rtl w:val="0"/>
         </w:rPr>
-        <w:t xml:space="preserve">Analisar o desempenho e eficiência do modelo;</w:t>
+        <w:t xml:space="preserve">Token Embeddings: os textos são inicialmente divididos em unidades menores chamadas tokens por meio do tokenizador WordPiece utilizado pelo modelo [1].</w:t>
       </w:r>
     </w:p>
     <w:p>
       <w:pPr>
         <w:numPr>
           <w:ilvl w:val="0"/>
-          <w:numId w:val="1"/>
+          <w:numId w:val="2"/>
         </w:numPr>
-        <w:ind w:left="720" w:hanging="360"/>
+        <w:ind w:left="1440" w:hanging="360"/>
         <w:rPr>
           <w:u w:val="none"/>
         </w:rPr>
@@ -2479,633 +3140,36 @@
         <w:rPr>
           <w:rtl w:val="0"/>
         </w:rPr>
-        <w:t xml:space="preserve">Formalizar uma biblioteca de software para o modelo;</w:t>
-      </w:r>
-      <w:r>
-        <w:br w:type="page"/>
-      </w:r>
-      <w:r>
-        <w:rPr>
-          <w:rtl w:val="0"/>
-        </w:rPr>
-      </w:r>
-    </w:p>
-    <w:p>
-      <w:pPr>
-        <w:pStyle w:val="Title"/>
-        <w:ind w:left="0" w:firstLine="0"/>
-        <w:rPr/>
-      </w:pPr>
-      <w:bookmarkStart w:colFirst="0" w:colLast="0" w:name="_i38tyx7t832k" w:id="2"/>
-      <w:bookmarkEnd w:id="2"/>
-      <w:r>
-        <w:rPr>
-          <w:rtl w:val="0"/>
-        </w:rPr>
-        <w:t xml:space="preserve">3 FUNDAMENTAÇÃO TEÓRICA</w:t>
-      </w:r>
-    </w:p>
-    <w:p>
-      <w:pPr>
-        <w:rPr/>
-      </w:pPr>
-      <w:r>
-        <w:rPr>
-          <w:rtl w:val="0"/>
-        </w:rPr>
-      </w:r>
-    </w:p>
-    <w:p>
-      <w:pPr>
-        <w:pStyle w:val="Subtitle"/>
-        <w:rPr/>
-      </w:pPr>
-      <w:bookmarkStart w:colFirst="0" w:colLast="0" w:name="_ul0vtgdmhavx" w:id="3"/>
-      <w:bookmarkEnd w:id="3"/>
-      <w:r>
-        <w:rPr>
-          <w:rtl w:val="0"/>
-        </w:rPr>
-        <w:t xml:space="preserve">3.1 Redes sociais e interações digitais</w:t>
-      </w:r>
-    </w:p>
-    <w:p>
-      <w:pPr>
-        <w:rPr/>
-      </w:pPr>
-      <w:r>
-        <w:rPr>
-          <w:rtl w:val="0"/>
-        </w:rPr>
-      </w:r>
-    </w:p>
-    <w:p>
-      <w:pPr>
-        <w:rPr/>
-      </w:pPr>
-      <w:r>
-        <w:rPr>
-          <w:rtl w:val="0"/>
-        </w:rPr>
-        <w:t xml:space="preserve">Sugestão: Contextualizar redes sociais, desde advento, popularização, modelo de interação (ex: ambiente flexível sem precisar ter contato real, e sem dependência temporal), discussões públicas e etc.</w:t>
-      </w:r>
-    </w:p>
-    <w:p>
-      <w:pPr>
-        <w:rPr/>
-      </w:pPr>
-      <w:r>
-        <w:rPr>
-          <w:rtl w:val="0"/>
-        </w:rPr>
-      </w:r>
-    </w:p>
-    <w:p>
-      <w:pPr>
-        <w:pStyle w:val="Subtitle"/>
-        <w:rPr/>
-      </w:pPr>
-      <w:bookmarkStart w:colFirst="0" w:colLast="0" w:name="_dpbnoeom4bh7" w:id="4"/>
-      <w:bookmarkEnd w:id="4"/>
-      <w:r>
-        <w:rPr>
-          <w:rtl w:val="0"/>
-        </w:rPr>
-        <w:t xml:space="preserve">3.2 Conflitos em interações textuais</w:t>
-      </w:r>
-    </w:p>
-    <w:p>
-      <w:pPr>
-        <w:rPr/>
-      </w:pPr>
-      <w:r>
-        <w:rPr>
-          <w:rtl w:val="0"/>
-        </w:rPr>
-      </w:r>
-    </w:p>
-    <w:p>
-      <w:pPr>
-        <w:rPr/>
-      </w:pPr>
-      <w:r>
-        <w:rPr>
-          <w:rtl w:val="0"/>
-        </w:rPr>
-        <w:t xml:space="preserve">A busca por uma definição de conflito trata-se de um desafio recorrente na literatura, não havendo um consenso universal sobre o seu significado. Segundo Lyamouri-Bajja et al. (2012), o conceito de conflito tem sido abordado sob diferentes perspectivas ao longo do tempo, variando em função do contexto histórico e social em que é analisado. Ainda segundo os autores, algumas definições concentram-se nas causas do conflito, como disputas por poder, divergências de valores ou fatores emocionais, enquanto outras focam na natureza dos atores envolvidos, sejam indivíduos, grupos ou organizações. Essa diversidade de abordagens deixa claro que o conflito não é um fenômeno unidimensional, mas sim um conceito que depende do contexto em que é analisado. Nesse sentido faz-se necessário uma operacionalização de sua definição a partir de recortes específicos, visando adaptar-se aos objetivos e ao domínio de aplicação do estudo.</w:t>
-      </w:r>
-    </w:p>
-    <w:p>
-      <w:pPr>
-        <w:rPr/>
-      </w:pPr>
-      <w:r>
-        <w:rPr>
-          <w:rtl w:val="0"/>
-        </w:rPr>
-        <w:t xml:space="preserve">No contexto de mídias sociais, essa necessidade se intensifica, dado a natureza dinâmica e linguagem característica dessas interações. Warke et. al. (2025), em um estudo com objetivos semelhantes ao do presente projeto, apontam que a abordagem predominante na detecção de conflito em textos tende a se concentrar na identificação de manifestações explicitamente antagônicas em interações adversas, isto é, situações em que há oposição clara entre os participantes. No entanto, o mesmo estudo propõe uma visão mais abrangente do fenômeno buscando capturar o espectro do conflito. Nessa abordagem, os autores se baseiam em um estudo de análise de caráter netnográfico sobre interações em plataformas sociais, no qual são identificados diferentes categorias associadas ao conflito, são elas: provocação, crítica, sarcasmo, trolling, assédio e ameaças. Essa abordagem garante uma detecção mais granular do conflito, consoante aos objetivos propostos no trabalho dos autores.</w:t>
-      </w:r>
-    </w:p>
-    <w:p>
-      <w:pPr>
-        <w:rPr/>
-      </w:pPr>
-      <w:r>
-        <w:rPr>
-          <w:rtl w:val="0"/>
-        </w:rPr>
-        <w:t xml:space="preserve">A partir dessas considerações, adota-se, neste trabalho, uma definição operacional de conflito voltada ao contexto de mídias sociais. Desta forma, considera-se que:</w:t>
-      </w:r>
-    </w:p>
-    <w:p>
-      <w:pPr>
-        <w:ind w:left="1133.858267716535" w:firstLine="0"/>
-        <w:rPr/>
-      </w:pPr>
-      <w:r>
-        <w:rPr>
-          <w:rtl w:val="0"/>
-        </w:rPr>
-        <w:t xml:space="preserve">Conflito consiste em manifestações abertamente antagônicas de interações adversas, incluindo formas implícitas (Provocação, crítica e sarcasmo) e explícitas (Assédio e ameaças), conforme tipologia derivada de estudo netnográfico.</w:t>
-      </w:r>
-    </w:p>
-    <w:p>
-      <w:pPr>
-        <w:rPr/>
-      </w:pPr>
-      <w:r>
-        <w:rPr>
-          <w:rtl w:val="0"/>
-        </w:rPr>
-        <w:t xml:space="preserve">Essa definição permite capturar não apenas conflitos explícitos, mas também formas sutis de antagonismo, sendo adequada ao objetivo deste trabalho de analisar relações discursivas entre pares de tweets.</w:t>
-      </w:r>
-    </w:p>
-    <w:p>
-      <w:pPr>
-        <w:rPr/>
-      </w:pPr>
-      <w:r>
-        <w:rPr>
-          <w:rtl w:val="0"/>
-        </w:rPr>
-      </w:r>
-    </w:p>
-    <w:p>
-      <w:pPr>
-        <w:pStyle w:val="Subtitle"/>
-        <w:rPr/>
-      </w:pPr>
-      <w:bookmarkStart w:colFirst="0" w:colLast="0" w:name="_x9pblf985rjg" w:id="5"/>
-      <w:bookmarkEnd w:id="5"/>
-      <w:r>
-        <w:rPr>
-          <w:rtl w:val="0"/>
-        </w:rPr>
-        <w:t xml:space="preserve">3.3 Processamento de Linguagem Natural </w:t>
-      </w:r>
-    </w:p>
-    <w:p>
-      <w:pPr>
-        <w:rPr/>
-      </w:pPr>
-      <w:r>
-        <w:rPr>
-          <w:rtl w:val="0"/>
-        </w:rPr>
-      </w:r>
-    </w:p>
-    <w:p>
-      <w:pPr>
-        <w:rPr/>
-      </w:pPr>
-      <w:r>
-        <w:rPr>
-          <w:rtl w:val="0"/>
-        </w:rPr>
-        <w:t xml:space="preserve">Introduzir o que é um PLN, suas tarefas, classificações em textos, NLP em redes sociais e desafios em operacionalizar tarefas de PLN em linguagens informais</w:t>
-      </w:r>
-    </w:p>
-    <w:p>
-      <w:pPr>
-        <w:rPr/>
-      </w:pPr>
-      <w:r>
-        <w:rPr>
-          <w:rtl w:val="0"/>
-        </w:rPr>
-      </w:r>
-    </w:p>
-    <w:p>
-      <w:pPr>
-        <w:rPr/>
-      </w:pPr>
-      <w:r>
-        <w:rPr>
-          <w:rtl w:val="0"/>
-        </w:rPr>
-      </w:r>
-    </w:p>
-    <w:p>
-      <w:pPr>
-        <w:pStyle w:val="Subtitle"/>
-        <w:rPr/>
-      </w:pPr>
-      <w:bookmarkStart w:colFirst="0" w:colLast="0" w:name="_kgsb936sst66" w:id="6"/>
-      <w:bookmarkEnd w:id="6"/>
-      <w:r>
-        <w:rPr>
-          <w:rtl w:val="0"/>
-        </w:rPr>
-        <w:t xml:space="preserve">3.4 Aprendizado de máquina e aprendizado profundo</w:t>
-      </w:r>
-    </w:p>
-    <w:p>
-      <w:pPr>
-        <w:rPr/>
-      </w:pPr>
-      <w:r>
-        <w:rPr>
-          <w:rtl w:val="0"/>
-        </w:rPr>
-      </w:r>
-    </w:p>
-    <w:p>
-      <w:pPr>
-        <w:rPr/>
-      </w:pPr>
-      <w:r>
-        <w:rPr>
-          <w:rtl w:val="0"/>
-        </w:rPr>
-        <w:t xml:space="preserve">Introduzir o conceito de ML supervisionado, a representação vetorial de texto, o aprendizado profundo aplicado a PLN, aprendizado por transferencia</w:t>
-      </w:r>
-    </w:p>
-    <w:p>
-      <w:pPr>
-        <w:rPr/>
-      </w:pPr>
-      <w:r>
-        <w:rPr>
-          <w:rtl w:val="0"/>
-        </w:rPr>
-      </w:r>
-    </w:p>
-    <w:p>
-      <w:pPr>
-        <w:pStyle w:val="Subtitle"/>
-        <w:rPr/>
-      </w:pPr>
-      <w:bookmarkStart w:colFirst="0" w:colLast="0" w:name="_4682ybnys95e" w:id="7"/>
-      <w:bookmarkEnd w:id="7"/>
-      <w:r>
-        <w:rPr>
-          <w:rtl w:val="0"/>
-        </w:rPr>
-        <w:t xml:space="preserve">3.5 Transformers</w:t>
-      </w:r>
-    </w:p>
-    <w:p>
-      <w:pPr>
-        <w:rPr/>
-      </w:pPr>
-      <w:r>
-        <w:rPr>
-          <w:rtl w:val="0"/>
-        </w:rPr>
-        <w:t xml:space="preserve">Introduzir o conceito de transformers, tarefa, exemplos</w:t>
-      </w:r>
-    </w:p>
-    <w:p>
-      <w:pPr>
-        <w:rPr/>
-      </w:pPr>
-      <w:r>
-        <w:rPr>
-          <w:rtl w:val="0"/>
-        </w:rPr>
-      </w:r>
-    </w:p>
-    <w:p>
-      <w:pPr>
-        <w:pStyle w:val="Heading3"/>
-        <w:rPr/>
-      </w:pPr>
-      <w:bookmarkStart w:colFirst="0" w:colLast="0" w:name="_qptpnjwe7y1q" w:id="8"/>
-      <w:bookmarkEnd w:id="8"/>
-      <w:r>
-        <w:rPr>
-          <w:rtl w:val="0"/>
-        </w:rPr>
-        <w:t xml:space="preserve">3.5.1 Arquitetura Transformer</w:t>
-      </w:r>
-    </w:p>
-    <w:p>
-      <w:pPr>
-        <w:rPr/>
-      </w:pPr>
-      <w:r>
-        <w:rPr>
-          <w:rtl w:val="0"/>
-        </w:rPr>
-        <w:t xml:space="preserve">Introduzir, sem tamanha formalidade matemática, a arquitetura de um transformer, dando noção sobre attention, embeddings, contexto bidirecional.</w:t>
-      </w:r>
-    </w:p>
-    <w:p>
-      <w:pPr>
-        <w:rPr/>
-      </w:pPr>
-      <w:r>
-        <w:rPr>
-          <w:rtl w:val="0"/>
-        </w:rPr>
-      </w:r>
-    </w:p>
-    <w:p>
-      <w:pPr>
-        <w:pStyle w:val="Subtitle"/>
-        <w:rPr/>
-      </w:pPr>
-      <w:bookmarkStart w:colFirst="0" w:colLast="0" w:name="_kpxa1gq0f13a" w:id="9"/>
-      <w:bookmarkEnd w:id="9"/>
-      <w:r>
-        <w:rPr>
-          <w:rtl w:val="0"/>
-        </w:rPr>
-        <w:t xml:space="preserve">3.6 Arquitetura BERT</w:t>
-      </w:r>
-    </w:p>
-    <w:p>
-      <w:pPr>
-        <w:rPr>
-          <w:highlight w:val="yellow"/>
-        </w:rPr>
-      </w:pPr>
-      <w:r>
-        <w:rPr>
-          <w:rtl w:val="0"/>
-        </w:rPr>
-      </w:r>
-    </w:p>
-    <w:p>
-      <w:pPr>
-        <w:rPr/>
-      </w:pPr>
-      <w:r>
-        <w:rPr>
-          <w:rtl w:val="0"/>
-        </w:rPr>
-        <w:t xml:space="preserve">O </w:t>
-      </w:r>
-      <w:r>
-        <w:rPr>
-          <w:i w:val="1"/>
-          <w:iCs w:val="1"/>
-          <w:rtl w:val="0"/>
-        </w:rPr>
-        <w:t xml:space="preserve">Bidirectional Encoder Representations from Transformers</w:t>
-      </w:r>
-      <w:r>
-        <w:rPr>
-          <w:rtl w:val="0"/>
-        </w:rPr>
-        <w:t xml:space="preserve"> (BERT) é um modelo de linguagem baseado na arquitetura Transformer desenvolvido para gerar representações contextuais profundas e bidirecionais a partir de grandes volumes de texto não </w:t>
-      </w:r>
-      <w:r>
-        <w:rPr>
-          <w:rtl w:val="0"/>
-        </w:rPr>
-        <w:t xml:space="preserve">rotulado</w:t>
-      </w:r>
-      <w:r>
-        <w:rPr>
-          <w:rtl w:val="0"/>
-        </w:rPr>
-        <w:t xml:space="preserve"> [1]. Diferentemente de modelos anteriores que processavam sequências textuais de forma unidirecional (da direita para a esquerda ou da esquerda para a direita), o BERT foi projetado para aprender representações considerando simultaneamente os contextos à esquerda e à direita de cada palavra em todas as camadas da rede, produzindo representações linguísticas mais contextualizadas [1].</w:t>
-      </w:r>
-    </w:p>
-    <w:p>
-      <w:pPr>
-        <w:rPr/>
-      </w:pPr>
-      <w:r>
-        <w:rPr>
-          <w:rtl w:val="0"/>
-        </w:rPr>
-        <w:t xml:space="preserve">Essa capacidade bidirecional permite que a representação de um termo seja construída a partir de todo o contexto em que ele aparece, produzindo representações linguísticas mais contextualizadas do que aquelas obtidas por embeddings estáticos ou modelos unidirecionais [1,2].</w:t>
-      </w:r>
-    </w:p>
-    <w:p>
-      <w:pPr>
-        <w:rPr/>
-      </w:pPr>
-      <w:r>
-        <w:rPr>
-          <w:rtl w:val="0"/>
-        </w:rPr>
-      </w:r>
-    </w:p>
-    <w:p>
-      <w:pPr>
-        <w:pStyle w:val="Heading3"/>
-        <w:rPr/>
-      </w:pPr>
-      <w:bookmarkStart w:colFirst="0" w:colLast="0" w:name="_604u9n3o06v" w:id="10"/>
-      <w:bookmarkEnd w:id="10"/>
-      <w:r>
-        <w:rPr>
-          <w:rtl w:val="0"/>
-        </w:rPr>
-        <w:t xml:space="preserve">3.6.1 Visão geral da arquitetura</w:t>
-      </w:r>
-    </w:p>
-    <w:p>
-      <w:pPr>
-        <w:rPr/>
-      </w:pPr>
-      <w:r>
-        <w:rPr>
-          <w:rtl w:val="0"/>
-        </w:rPr>
-      </w:r>
-    </w:p>
-    <w:p>
-      <w:pPr>
-        <w:rPr/>
-      </w:pPr>
-      <w:r>
-        <w:rPr>
-          <w:rtl w:val="0"/>
-        </w:rPr>
-        <w:t xml:space="preserve">A arquitetura do BERT é derivada do Transformer proposto por Vaswani et al., utilizando exclusivamente a porção codificadora da arquitetura original [1]. O modelo é composto por múltiplas camadas empilhadas de mecanismos de autoatenção (self-attention) e redes neurais feed-forward, permitindo o processamento paralelo das sequências de entrada e a modelagem de dependências de longo alcance entre os termos do texto [1].</w:t>
-      </w:r>
-    </w:p>
-    <w:p>
-      <w:pPr>
-        <w:rPr/>
-      </w:pPr>
-      <w:r>
-        <w:rPr>
-          <w:rtl w:val="0"/>
-        </w:rPr>
-        <w:t xml:space="preserve">Diferentemente das arquiteturas recorrentes tradicionais, o mecanismo de autoatenção permite que cada token da sequência interaja diretamente com todos os demais tokens durante o processo, o que favorece a construção de representações contextuais ricas [1]. De acordo com Rogers et al. [2], estudos posteriores evidenciaram que diferentes camadas do BERT capturam diferentes tipos de conhecimento linguístico, contribuindo para o desempenho do modelo em tarefas de compreensão de linguagem.</w:t>
-      </w:r>
-    </w:p>
-    <w:p>
-      <w:pPr>
-        <w:rPr/>
-      </w:pPr>
-      <w:r>
-        <w:rPr>
-          <w:rtl w:val="0"/>
-        </w:rPr>
-        <w:t xml:space="preserve">No artigo que apresentou o modelo, os autores especificaram duas configurações principais de tamanho para a sua aplicação: </w:t>
-      </w:r>
-    </w:p>
-    <w:p>
-      <w:pPr>
-        <w:rPr/>
-      </w:pPr>
-      <w:r>
-        <w:rPr>
-          <w:rtl w:val="0"/>
-        </w:rPr>
-      </w:r>
-    </w:p>
-    <w:p>
-      <w:pPr>
-        <w:rPr/>
-      </w:pPr>
-      <w:r>
-        <w:rPr>
-          <w:rtl w:val="0"/>
-        </w:rPr>
-      </w:r>
-    </w:p>
-    <w:p>
-      <w:pPr>
-        <w:pStyle w:val="Subtitle"/>
-        <w:rPr/>
-      </w:pPr>
-      <w:bookmarkStart w:colFirst="0" w:colLast="0" w:name="_esp1xl3ydlsy" w:id="11"/>
-      <w:bookmarkEnd w:id="11"/>
-      <w:r>
-        <w:rPr>
-          <w:rtl w:val="0"/>
-        </w:rPr>
-        <w:t xml:space="preserve">3.7 BERTimbau</w:t>
-      </w:r>
-    </w:p>
-    <w:p>
-      <w:pPr>
-        <w:rPr/>
-      </w:pPr>
-      <w:r>
-        <w:rPr>
-          <w:rtl w:val="0"/>
-        </w:rPr>
-        <w:t xml:space="preserve">Comentar que é um modelo BERT adaptado para o português; citar o corpus usado, vantagens, e uso em aplicações PLN em português</w:t>
-      </w:r>
-    </w:p>
-    <w:p>
-      <w:pPr>
-        <w:rPr/>
-      </w:pPr>
-      <w:r>
-        <w:rPr>
-          <w:rtl w:val="0"/>
-        </w:rPr>
-      </w:r>
-    </w:p>
-    <w:p>
-      <w:pPr>
-        <w:pStyle w:val="Subtitle"/>
-        <w:rPr/>
-      </w:pPr>
-      <w:bookmarkStart w:colFirst="0" w:colLast="0" w:name="_l2h2uue5zkmi" w:id="12"/>
-      <w:bookmarkEnd w:id="12"/>
-      <w:r>
-        <w:rPr>
-          <w:rtl w:val="0"/>
-        </w:rPr>
-        <w:t xml:space="preserve">3.8 Trabalhos relacionados</w:t>
-      </w:r>
-    </w:p>
-    <w:p>
-      <w:pPr>
-        <w:rPr/>
-      </w:pPr>
-      <w:r>
-        <w:rPr>
-          <w:rtl w:val="0"/>
-        </w:rPr>
-        <w:t xml:space="preserve">Comentar sobre trabalhos relacionados como  “Spectrum of conflict”, “Hate speech detection”, “sentiment analysis in social media”. Comparar idioma, dataset, tipo de conflito e método - De repente fazer uma tabela comparativa</w:t>
-      </w:r>
-      <w:r>
-        <w:br w:type="page"/>
-      </w:r>
-      <w:r>
-        <w:rPr>
-          <w:rtl w:val="0"/>
-        </w:rPr>
-      </w:r>
-    </w:p>
-    <w:p>
-      <w:pPr>
-        <w:pStyle w:val="Title"/>
-        <w:rPr/>
-      </w:pPr>
-      <w:bookmarkStart w:colFirst="0" w:colLast="0" w:name="_qr58d23lut8i" w:id="13"/>
-      <w:bookmarkEnd w:id="13"/>
-      <w:r>
-        <w:rPr>
-          <w:rtl w:val="0"/>
-        </w:rPr>
-        <w:t xml:space="preserve">4 MATERIAIS E MÉTODOS</w:t>
-      </w:r>
-    </w:p>
-    <w:p>
-      <w:pPr>
-        <w:rPr/>
-      </w:pPr>
-      <w:r>
-        <w:rPr>
-          <w:rtl w:val="0"/>
-        </w:rPr>
-      </w:r>
-    </w:p>
-    <w:p>
-      <w:pPr>
-        <w:pStyle w:val="Subtitle"/>
-        <w:rPr/>
-      </w:pPr>
-      <w:bookmarkStart w:colFirst="0" w:colLast="0" w:name="_6pbcklu290d8" w:id="14"/>
-      <w:bookmarkEnd w:id="14"/>
-      <w:r>
-        <w:rPr>
-          <w:rtl w:val="0"/>
-        </w:rPr>
-        <w:t xml:space="preserve">4.1 Base de dados</w:t>
-      </w:r>
-    </w:p>
-    <w:p>
-      <w:pPr>
-        <w:rPr/>
-      </w:pPr>
-      <w:r>
-        <w:rPr>
-          <w:rtl w:val="0"/>
-        </w:rPr>
-      </w:r>
-    </w:p>
-    <w:p>
-      <w:pPr>
-        <w:rPr/>
-      </w:pPr>
-      <w:r>
-        <w:rPr>
-          <w:rtl w:val="0"/>
-        </w:rPr>
-        <w:t xml:space="preserve">Os dados utilizados neste projeto consistem em um conjunto de postagens públicas, em língua portuguesa, coletadas da plataforma X (antigo Twitter) pelo orientador do presente trabalho, Dr. Carlos Da Silva Santos, em 2020, no contexto de um projeto anterior conduzido por ele. A coleta foi direcionada a três temas específicos de relevância social e política no periodo analisado: aborto, cloroquina e mandetta. Como resultado, foram gerados três conjuntos principais de dados, cada um contendo publicações relacionadas a um destes temas, oferecendo assim uma certa homogeneidade temática a cada subconjunto</w:t>
+        <w:t xml:space="preserve">Segment Embeddings: Trata-se de uma sequência vetorial utilizada para indicar a qual sentença cada token pertence quando a entrada é composta por um par de sentenças. Nesse caso, os tokens são identificados como pertencentes à Sentença A ou à Sentença B [1].</w:t>
+      </w:r>
+    </w:p>
+    <w:p>
+      <w:pPr>
+        <w:numPr>
+          <w:ilvl w:val="0"/>
+          <w:numId w:val="2"/>
+        </w:numPr>
+        <w:ind w:left="1440" w:hanging="360"/>
+        <w:rPr>
+          <w:u w:val="none"/>
+        </w:rPr>
+      </w:pPr>
+      <w:r>
+        <w:rPr>
+          <w:rtl w:val="0"/>
+        </w:rPr>
+        <w:t xml:space="preserve">Position Embeddings: São vetores adicionados para codificar a posição de cada token dentro da sequência de entrada. Essa informação é necessária porque a arquitetura Transformer não possui mecanismos recorrentes capazes de representar naturalmente a ordem sequencial dos elementos [1]. </w:t>
+      </w:r>
+    </w:p>
+    <w:p>
+      <w:pPr>
+        <w:ind w:left="1440" w:firstLine="0"/>
+        <w:rPr/>
+      </w:pPr>
+      <w:r>
+        <w:rPr>
+          <w:rtl w:val="0"/>
+        </w:rPr>
       </w:r>
     </w:p>
     <w:p>
@@ -3117,161 +3181,7 @@
         <w:rPr>
           <w:rtl w:val="0"/>
         </w:rPr>
-      </w:r>
-    </w:p>
-    <w:p>
-      <w:pPr>
-        <w:pStyle w:val="Heading3"/>
-        <w:rPr/>
-      </w:pPr>
-      <w:bookmarkStart w:colFirst="0" w:colLast="0" w:name="_nxke2ogiu7lp" w:id="15"/>
-      <w:bookmarkEnd w:id="15"/>
-      <w:r>
-        <w:rPr>
-          <w:rtl w:val="0"/>
-        </w:rPr>
-        <w:t xml:space="preserve">4.1.1 Estrutura e construção do dataset</w:t>
-      </w:r>
-    </w:p>
-    <w:p>
-      <w:pPr>
-        <w:rPr/>
-      </w:pPr>
-      <w:r>
-        <w:rPr>
-          <w:rtl w:val="0"/>
-        </w:rPr>
-      </w:r>
-    </w:p>
-    <w:p>
-      <w:pPr>
-        <w:rPr/>
-      </w:pPr>
-      <w:r>
-        <w:rPr>
-          <w:rtl w:val="0"/>
-        </w:rPr>
-        <w:t xml:space="preserve">Cada subconjunto temático foi originalmente armazenado no formato JSON Lines (JSONL), no qual cada linha corresponde a um objeto JSON independente. Neste contexto, cada objeto JSON representa uma entidade completa de tweet, contendo seus respectivos atributos organizados em pares chave-valor, como conteúdo textual, identificadores únicos e metadados associados às interações. Essa organização resultante corresponde ao formato de retorno da antiga API da plataforma X (twitter), na qual cada tweet é representado como um objeto estruturado composto por diversos campos, incluindo texto, informações do usuário, e dados relacionados às interações, como respostas, citações e métricas de engajamento (1). O esquema 1 apresenta a estrutura do arquivo JSON gerado pela antiga API da plataforma X.</w:t>
-      </w:r>
-    </w:p>
-    <w:p>
-      <w:pPr>
-        <w:rPr/>
-      </w:pPr>
-      <w:r>
-        <w:rPr>
-          <w:rtl w:val="0"/>
-        </w:rPr>
-      </w:r>
-    </w:p>
-    <w:p>
-      <w:pPr>
-        <w:rPr/>
-      </w:pPr>
-      <w:r>
-        <w:rPr>
-          <w:rtl w:val="0"/>
-        </w:rPr>
-      </w:r>
-    </w:p>
-    <w:p>
-      <w:pPr>
-        <w:rPr/>
-      </w:pPr>
-      <w:r>
-        <w:rPr>
-          <w:rtl w:val="0"/>
-        </w:rPr>
-      </w:r>
-    </w:p>
-    <w:p>
-      <w:pPr>
-        <w:rPr/>
-      </w:pPr>
-      <w:r>
-        <w:rPr>
-          <w:rtl w:val="0"/>
-        </w:rPr>
-      </w:r>
-    </w:p>
-    <w:p>
-      <w:pPr>
-        <w:rPr/>
-      </w:pPr>
-      <w:r>
-        <w:rPr>
-          <w:rtl w:val="0"/>
-        </w:rPr>
-      </w:r>
-    </w:p>
-    <w:p>
-      <w:pPr>
-        <w:rPr/>
-      </w:pPr>
-      <w:r>
-        <w:rPr>
-          <w:rtl w:val="0"/>
-        </w:rPr>
-      </w:r>
-    </w:p>
-    <w:p>
-      <w:pPr>
-        <w:rPr/>
-      </w:pPr>
-      <w:r>
-        <w:rPr>
-          <w:rtl w:val="0"/>
-        </w:rPr>
-      </w:r>
-    </w:p>
-    <w:p>
-      <w:pPr>
-        <w:rPr/>
-      </w:pPr>
-      <w:r>
-        <w:rPr>
-          <w:rtl w:val="0"/>
-        </w:rPr>
-      </w:r>
-    </w:p>
-    <w:p>
-      <w:pPr>
-        <w:rPr/>
-      </w:pPr>
-      <w:r>
-        <w:rPr>
-          <w:rtl w:val="0"/>
-        </w:rPr>
-      </w:r>
-    </w:p>
-    <w:p>
-      <w:pPr>
-        <w:rPr/>
-      </w:pPr>
-      <w:r>
-        <w:rPr>
-          <w:rtl w:val="0"/>
-        </w:rPr>
-      </w:r>
-    </w:p>
-    <w:p>
-      <w:pPr>
-        <w:rPr/>
-      </w:pPr>
-      <w:r>
-        <w:rPr>
-          <w:rtl w:val="0"/>
-        </w:rPr>
-      </w:r>
-    </w:p>
-    <w:p>
-      <w:pPr>
-        <w:rPr/>
-      </w:pPr>
-      <w:r>
-        <w:rPr>
-          <w:rtl w:val="0"/>
-        </w:rPr>
+        <w:t xml:space="preserve">Além desses componentes, o BERT utiliza dois tokens especiais para estruturar suas entradas. O token [CLS] é inserido obrigatoriamente no início da sequência e sua representação final pode ser utilizada em tarefas de classificação. Já o token [SEP] é utilizado para separar sentenças distintas ou indicar o término da sequência de entrada [1]. O esquema 1 apresenta a representação de entrada utilizada pelo BERT, ilustrando a combinação dos diferentes embeddings e a utilização dos tokens especiais na organização das sequências processadas pelo modelo.</w:t>
       </w:r>
     </w:p>
     <w:p>
@@ -3283,21 +3193,31 @@
         <w:rPr>
           <w:rtl w:val="0"/>
         </w:rPr>
-        <w:t xml:space="preserve">Esquema 1 - Estrutura do arquivo JSONL e do objeto Tweet</w:t>
-      </w:r>
-    </w:p>
-    <w:p>
-      <w:pPr>
-        <w:spacing w:after="160" w:line="259" w:lineRule="auto"/>
-        <w:ind w:firstLine="0"/>
-        <w:jc w:val="center"/>
+      </w:r>
+    </w:p>
+    <w:p>
+      <w:pPr>
+        <w:ind w:firstLine="283.46456692913375"/>
+        <w:rPr/>
+      </w:pPr>
+      <w:r>
+        <w:rPr>
+          <w:rtl w:val="0"/>
+        </w:rPr>
+        <w:t xml:space="preserve">Esquema 1 - Representação de entrada utilizada pelo BERT</w:t>
+      </w:r>
+    </w:p>
+    <w:p>
+      <w:pPr>
+        <w:ind w:firstLine="141.73228346456688"/>
+        <w:jc w:val="left"/>
         <w:rPr/>
       </w:pPr>
       <w:r>
         <w:rPr/>
         <w:drawing>
           <wp:inline distB="114300" distT="114300" distL="114300" distR="114300">
-            <wp:extent cx="5399730" cy="2959100"/>
+            <wp:extent cx="5697038" cy="1729286"/>
             <wp:effectExtent b="0" l="0" r="0" t="0"/>
             <wp:docPr id="1" name="image1.png"/>
             <a:graphic>
@@ -3309,6 +3229,417 @@
                   </pic:nvPicPr>
                   <pic:blipFill>
                     <a:blip r:embed="rId8"/>
+                    <a:srcRect b="4794" l="2579" r="5188" t="0"/>
+                    <a:stretch>
+                      <a:fillRect/>
+                    </a:stretch>
+                  </pic:blipFill>
+                  <pic:spPr>
+                    <a:xfrm>
+                      <a:off x="0" y="0"/>
+                      <a:ext cx="5697038" cy="1729286"/>
+                    </a:xfrm>
+                    <a:prstGeom prst="rect"/>
+                    <a:ln/>
+                  </pic:spPr>
+                </pic:pic>
+              </a:graphicData>
+            </a:graphic>
+          </wp:inline>
+        </w:drawing>
+      </w:r>
+      <w:r>
+        <w:rPr>
+          <w:rtl w:val="0"/>
+        </w:rPr>
+      </w:r>
+    </w:p>
+    <w:p>
+      <w:pPr>
+        <w:ind w:firstLine="283.46456692913375"/>
+        <w:rPr/>
+      </w:pPr>
+      <w:r>
+        <w:rPr>
+          <w:rtl w:val="0"/>
+        </w:rPr>
+        <w:t xml:space="preserve">Fonte: Devlin et al. [1]</w:t>
+      </w:r>
+    </w:p>
+    <w:p>
+      <w:pPr>
+        <w:ind w:firstLine="141.73228346456688"/>
+        <w:jc w:val="left"/>
+        <w:rPr/>
+      </w:pPr>
+      <w:r>
+        <w:rPr>
+          <w:rtl w:val="0"/>
+        </w:rPr>
+      </w:r>
+    </w:p>
+    <w:p>
+      <w:pPr>
+        <w:ind w:firstLine="720"/>
+        <w:rPr/>
+      </w:pPr>
+      <w:r>
+        <w:rPr>
+          <w:rtl w:val="0"/>
+        </w:rPr>
+        <w:t xml:space="preserve">A soma vetorial dos Token Embeddings, Segment Embeddings e Position Embeddings produz a representação final utilizada como entrada para as camadas codificadoras do modelo [1].</w:t>
+      </w:r>
+    </w:p>
+    <w:p>
+      <w:pPr>
+        <w:ind w:firstLine="720"/>
+        <w:rPr/>
+      </w:pPr>
+      <w:r>
+        <w:rPr>
+          <w:rtl w:val="0"/>
+        </w:rPr>
+      </w:r>
+    </w:p>
+    <w:p>
+      <w:pPr>
+        <w:ind w:firstLine="720"/>
+        <w:rPr/>
+      </w:pPr>
+      <w:r>
+        <w:rPr>
+          <w:rtl w:val="0"/>
+        </w:rPr>
+      </w:r>
+    </w:p>
+    <w:p>
+      <w:pPr>
+        <w:pStyle w:val="Subtitle"/>
+        <w:rPr/>
+      </w:pPr>
+      <w:bookmarkStart w:colFirst="0" w:colLast="0" w:name="_esp1xl3ydlsy" w:id="13"/>
+      <w:bookmarkEnd w:id="13"/>
+      <w:r>
+        <w:rPr>
+          <w:rtl w:val="0"/>
+        </w:rPr>
+        <w:t xml:space="preserve">3.7 BERTimbau</w:t>
+      </w:r>
+    </w:p>
+    <w:p>
+      <w:pPr>
+        <w:rPr/>
+      </w:pPr>
+      <w:r>
+        <w:rPr>
+          <w:rtl w:val="0"/>
+        </w:rPr>
+        <w:t xml:space="preserve">Comentar que é um modelo BERT adaptado para o português; citar o corpus usado, vantagens, e uso em aplicações PLN em português</w:t>
+      </w:r>
+    </w:p>
+    <w:p>
+      <w:pPr>
+        <w:rPr/>
+      </w:pPr>
+      <w:r>
+        <w:rPr>
+          <w:rtl w:val="0"/>
+        </w:rPr>
+      </w:r>
+    </w:p>
+    <w:p>
+      <w:pPr>
+        <w:pStyle w:val="Subtitle"/>
+        <w:rPr/>
+      </w:pPr>
+      <w:bookmarkStart w:colFirst="0" w:colLast="0" w:name="_l2h2uue5zkmi" w:id="14"/>
+      <w:bookmarkEnd w:id="14"/>
+      <w:r>
+        <w:rPr>
+          <w:rtl w:val="0"/>
+        </w:rPr>
+        <w:t xml:space="preserve">3.8 Trabalhos relacionados</w:t>
+      </w:r>
+    </w:p>
+    <w:p>
+      <w:pPr>
+        <w:rPr/>
+      </w:pPr>
+      <w:r>
+        <w:rPr>
+          <w:rtl w:val="0"/>
+        </w:rPr>
+        <w:t xml:space="preserve">Comentar sobre trabalhos relacionados como  “Spectrum of conflict”, “Hate speech detection”, “sentiment analysis in social media”. Comparar idioma, dataset, tipo de conflito e método - De repente fazer uma tabela comparativa</w:t>
+      </w:r>
+      <w:r>
+        <w:br w:type="page"/>
+      </w:r>
+      <w:r>
+        <w:rPr>
+          <w:rtl w:val="0"/>
+        </w:rPr>
+      </w:r>
+    </w:p>
+    <w:p>
+      <w:pPr>
+        <w:pStyle w:val="Title"/>
+        <w:rPr/>
+      </w:pPr>
+      <w:bookmarkStart w:colFirst="0" w:colLast="0" w:name="_qr58d23lut8i" w:id="15"/>
+      <w:bookmarkEnd w:id="15"/>
+      <w:r>
+        <w:rPr>
+          <w:rtl w:val="0"/>
+        </w:rPr>
+        <w:t xml:space="preserve">4 MATERIAIS E MÉTODOS</w:t>
+      </w:r>
+    </w:p>
+    <w:p>
+      <w:pPr>
+        <w:rPr/>
+      </w:pPr>
+      <w:r>
+        <w:rPr>
+          <w:rtl w:val="0"/>
+        </w:rPr>
+      </w:r>
+    </w:p>
+    <w:p>
+      <w:pPr>
+        <w:pStyle w:val="Subtitle"/>
+        <w:rPr/>
+      </w:pPr>
+      <w:bookmarkStart w:colFirst="0" w:colLast="0" w:name="_6pbcklu290d8" w:id="16"/>
+      <w:bookmarkEnd w:id="16"/>
+      <w:r>
+        <w:rPr>
+          <w:rtl w:val="0"/>
+        </w:rPr>
+        <w:t xml:space="preserve">4.1 Base de dados</w:t>
+      </w:r>
+    </w:p>
+    <w:p>
+      <w:pPr>
+        <w:rPr/>
+      </w:pPr>
+      <w:r>
+        <w:rPr>
+          <w:rtl w:val="0"/>
+        </w:rPr>
+      </w:r>
+    </w:p>
+    <w:p>
+      <w:pPr>
+        <w:rPr/>
+      </w:pPr>
+      <w:r>
+        <w:rPr>
+          <w:rtl w:val="0"/>
+        </w:rPr>
+        <w:t xml:space="preserve">Os dados utilizados neste projeto consistem em um conjunto de postagens públicas, em língua portuguesa, coletadas da plataforma X (antigo Twitter) pelo orientador do presente trabalho, Dr. Carlos Da Silva Santos, em 2020, no contexto de um projeto anterior conduzido por ele. A coleta foi direcionada a três temas específicos de relevância social e política no periodo analisado: aborto, cloroquina e mandetta. Como resultado, foram gerados três conjuntos principais de dados, cada um contendo publicações relacionadas a um destes temas, oferecendo assim uma certa homogeneidade temática a cada subconjunto</w:t>
+      </w:r>
+    </w:p>
+    <w:p>
+      <w:pPr>
+        <w:ind w:firstLine="720"/>
+        <w:rPr/>
+      </w:pPr>
+      <w:r>
+        <w:rPr>
+          <w:rtl w:val="0"/>
+        </w:rPr>
+      </w:r>
+    </w:p>
+    <w:p>
+      <w:pPr>
+        <w:pStyle w:val="Heading3"/>
+        <w:rPr/>
+      </w:pPr>
+      <w:bookmarkStart w:colFirst="0" w:colLast="0" w:name="_nxke2ogiu7lp" w:id="17"/>
+      <w:bookmarkEnd w:id="17"/>
+      <w:r>
+        <w:rPr>
+          <w:rtl w:val="0"/>
+        </w:rPr>
+        <w:t xml:space="preserve">4.1.1 Estrutura e construção do dataset</w:t>
+      </w:r>
+    </w:p>
+    <w:p>
+      <w:pPr>
+        <w:rPr/>
+      </w:pPr>
+      <w:r>
+        <w:rPr>
+          <w:rtl w:val="0"/>
+        </w:rPr>
+      </w:r>
+    </w:p>
+    <w:p>
+      <w:pPr>
+        <w:rPr/>
+      </w:pPr>
+      <w:r>
+        <w:rPr>
+          <w:rtl w:val="0"/>
+        </w:rPr>
+        <w:t xml:space="preserve">Cada subconjunto temático foi originalmente armazenado no formato JSON Lines (JSONL), no qual cada linha corresponde a um objeto JSON independente. Neste contexto, cada objeto JSON representa uma entidade completa de tweet, contendo seus respectivos atributos organizados em pares chave-valor, como conteúdo textual, identificadores únicos e metadados associados às interações. Essa organização resultante corresponde ao formato de retorno da antiga API da plataforma X (twitter), na qual cada tweet é representado como um objeto estruturado composto por diversos campos, incluindo texto, informações do usuário, e dados relacionados às interações, como respostas, citações e métricas de engajamento (1). O esquema 1 apresenta a estrutura do arquivo JSON gerado pela antiga API da plataforma X.</w:t>
+      </w:r>
+    </w:p>
+    <w:p>
+      <w:pPr>
+        <w:rPr/>
+      </w:pPr>
+      <w:r>
+        <w:rPr>
+          <w:rtl w:val="0"/>
+        </w:rPr>
+      </w:r>
+    </w:p>
+    <w:p>
+      <w:pPr>
+        <w:rPr/>
+      </w:pPr>
+      <w:r>
+        <w:rPr>
+          <w:rtl w:val="0"/>
+        </w:rPr>
+      </w:r>
+    </w:p>
+    <w:p>
+      <w:pPr>
+        <w:rPr/>
+      </w:pPr>
+      <w:r>
+        <w:rPr>
+          <w:rtl w:val="0"/>
+        </w:rPr>
+      </w:r>
+    </w:p>
+    <w:p>
+      <w:pPr>
+        <w:rPr/>
+      </w:pPr>
+      <w:r>
+        <w:rPr>
+          <w:rtl w:val="0"/>
+        </w:rPr>
+      </w:r>
+    </w:p>
+    <w:p>
+      <w:pPr>
+        <w:rPr/>
+      </w:pPr>
+      <w:r>
+        <w:rPr>
+          <w:rtl w:val="0"/>
+        </w:rPr>
+      </w:r>
+    </w:p>
+    <w:p>
+      <w:pPr>
+        <w:rPr/>
+      </w:pPr>
+      <w:r>
+        <w:rPr>
+          <w:rtl w:val="0"/>
+        </w:rPr>
+      </w:r>
+    </w:p>
+    <w:p>
+      <w:pPr>
+        <w:rPr/>
+      </w:pPr>
+      <w:r>
+        <w:rPr>
+          <w:rtl w:val="0"/>
+        </w:rPr>
+      </w:r>
+    </w:p>
+    <w:p>
+      <w:pPr>
+        <w:rPr/>
+      </w:pPr>
+      <w:r>
+        <w:rPr>
+          <w:rtl w:val="0"/>
+        </w:rPr>
+      </w:r>
+    </w:p>
+    <w:p>
+      <w:pPr>
+        <w:rPr/>
+      </w:pPr>
+      <w:r>
+        <w:rPr>
+          <w:rtl w:val="0"/>
+        </w:rPr>
+      </w:r>
+    </w:p>
+    <w:p>
+      <w:pPr>
+        <w:rPr/>
+      </w:pPr>
+      <w:r>
+        <w:rPr>
+          <w:rtl w:val="0"/>
+        </w:rPr>
+      </w:r>
+    </w:p>
+    <w:p>
+      <w:pPr>
+        <w:rPr/>
+      </w:pPr>
+      <w:r>
+        <w:rPr>
+          <w:rtl w:val="0"/>
+        </w:rPr>
+      </w:r>
+    </w:p>
+    <w:p>
+      <w:pPr>
+        <w:rPr/>
+      </w:pPr>
+      <w:r>
+        <w:rPr>
+          <w:rtl w:val="0"/>
+        </w:rPr>
+      </w:r>
+    </w:p>
+    <w:p>
+      <w:pPr>
+        <w:ind w:firstLine="283.46456692913375"/>
+        <w:rPr/>
+      </w:pPr>
+      <w:r>
+        <w:rPr>
+          <w:rtl w:val="0"/>
+        </w:rPr>
+        <w:t xml:space="preserve">Esquema 1 - Estrutura do arquivo JSONL e do objeto Tweet</w:t>
+      </w:r>
+    </w:p>
+    <w:p>
+      <w:pPr>
+        <w:spacing w:after="160" w:line="259" w:lineRule="auto"/>
+        <w:ind w:firstLine="0"/>
+        <w:jc w:val="center"/>
+        <w:rPr/>
+      </w:pPr>
+      <w:r>
+        <w:rPr/>
+        <w:drawing>
+          <wp:inline distB="114300" distT="114300" distL="114300" distR="114300">
+            <wp:extent cx="5399730" cy="2959100"/>
+            <wp:effectExtent b="0" l="0" r="0" t="0"/>
+            <wp:docPr id="2" name="image2.png"/>
+            <a:graphic>
+              <a:graphicData uri="http://schemas.openxmlformats.org/drawingml/2006/picture">
+                <pic:pic>
+                  <pic:nvPicPr>
+                    <pic:cNvPr id="0" name="image2.png"/>
+                    <pic:cNvPicPr preferRelativeResize="0"/>
+                  </pic:nvPicPr>
+                  <pic:blipFill>
+                    <a:blip r:embed="rId9"/>
                     <a:srcRect b="0" l="0" r="0" t="0"/>
                     <a:stretch>
                       <a:fillRect/>
@@ -3404,8 +3735,8 @@
         <w:pStyle w:val="Heading3"/>
         <w:rPr/>
       </w:pPr>
-      <w:bookmarkStart w:colFirst="0" w:colLast="0" w:name="_4olqhs13jcs" w:id="16"/>
-      <w:bookmarkEnd w:id="16"/>
+      <w:bookmarkStart w:colFirst="0" w:colLast="0" w:name="_4olqhs13jcs" w:id="18"/>
+      <w:bookmarkEnd w:id="18"/>
       <w:r>
         <w:rPr>
           <w:rtl w:val="0"/>
@@ -3482,8 +3813,8 @@
         <w:pStyle w:val="Heading3"/>
         <w:rPr/>
       </w:pPr>
-      <w:bookmarkStart w:colFirst="0" w:colLast="0" w:name="_gq5iftmo11gg" w:id="17"/>
-      <w:bookmarkEnd w:id="17"/>
+      <w:bookmarkStart w:colFirst="0" w:colLast="0" w:name="_gq5iftmo11gg" w:id="19"/>
+      <w:bookmarkEnd w:id="19"/>
       <w:r>
         <w:rPr>
           <w:rtl w:val="0"/>
@@ -4049,8 +4380,8 @@
         <w:pStyle w:val="Heading3"/>
         <w:rPr/>
       </w:pPr>
-      <w:bookmarkStart w:colFirst="0" w:colLast="0" w:name="_z3usglqi5uex" w:id="18"/>
-      <w:bookmarkEnd w:id="18"/>
+      <w:bookmarkStart w:colFirst="0" w:colLast="0" w:name="_z3usglqi5uex" w:id="20"/>
+      <w:bookmarkEnd w:id="20"/>
       <w:r>
         <w:rPr>
           <w:rtl w:val="0"/>
@@ -4062,8 +4393,8 @@
         <w:pStyle w:val="Heading3"/>
         <w:rPr/>
       </w:pPr>
-      <w:bookmarkStart w:colFirst="0" w:colLast="0" w:name="_8jgsl88a88b7" w:id="19"/>
-      <w:bookmarkEnd w:id="19"/>
+      <w:bookmarkStart w:colFirst="0" w:colLast="0" w:name="_8jgsl88a88b7" w:id="21"/>
+      <w:bookmarkEnd w:id="21"/>
       <w:r>
         <w:rPr>
           <w:rtl w:val="0"/>
@@ -4075,8 +4406,8 @@
         <w:pStyle w:val="Heading3"/>
         <w:rPr/>
       </w:pPr>
-      <w:bookmarkStart w:colFirst="0" w:colLast="0" w:name="_rk2pdx4noqvo" w:id="20"/>
-      <w:bookmarkEnd w:id="20"/>
+      <w:bookmarkStart w:colFirst="0" w:colLast="0" w:name="_rk2pdx4noqvo" w:id="22"/>
+      <w:bookmarkEnd w:id="22"/>
       <w:r>
         <w:rPr>
           <w:rtl w:val="0"/>
@@ -4088,8 +4419,8 @@
         <w:pStyle w:val="Heading3"/>
         <w:rPr/>
       </w:pPr>
-      <w:bookmarkStart w:colFirst="0" w:colLast="0" w:name="_hycjq0pmvxdy" w:id="21"/>
-      <w:bookmarkEnd w:id="21"/>
+      <w:bookmarkStart w:colFirst="0" w:colLast="0" w:name="_hycjq0pmvxdy" w:id="23"/>
+      <w:bookmarkEnd w:id="23"/>
       <w:r>
         <w:rPr>
           <w:rtl w:val="0"/>
@@ -4101,8 +4432,8 @@
         <w:pStyle w:val="Heading3"/>
         <w:rPr/>
       </w:pPr>
-      <w:bookmarkStart w:colFirst="0" w:colLast="0" w:name="_8r1vlmwupuil" w:id="22"/>
-      <w:bookmarkEnd w:id="22"/>
+      <w:bookmarkStart w:colFirst="0" w:colLast="0" w:name="_8r1vlmwupuil" w:id="24"/>
+      <w:bookmarkEnd w:id="24"/>
       <w:r>
         <w:rPr>
           <w:rtl w:val="0"/>
@@ -4114,8 +4445,8 @@
         <w:pStyle w:val="Heading3"/>
         <w:rPr/>
       </w:pPr>
-      <w:bookmarkStart w:colFirst="0" w:colLast="0" w:name="_bp05maj0far1" w:id="23"/>
-      <w:bookmarkEnd w:id="23"/>
+      <w:bookmarkStart w:colFirst="0" w:colLast="0" w:name="_bp05maj0far1" w:id="25"/>
+      <w:bookmarkEnd w:id="25"/>
       <w:r>
         <w:rPr>
           <w:rtl w:val="0"/>
@@ -4127,8 +4458,8 @@
         <w:pStyle w:val="Heading3"/>
         <w:rPr/>
       </w:pPr>
-      <w:bookmarkStart w:colFirst="0" w:colLast="0" w:name="_dot5rl8p0mqw" w:id="24"/>
-      <w:bookmarkEnd w:id="24"/>
+      <w:bookmarkStart w:colFirst="0" w:colLast="0" w:name="_dot5rl8p0mqw" w:id="26"/>
+      <w:bookmarkEnd w:id="26"/>
       <w:r>
         <w:rPr>
           <w:rtl w:val="0"/>
@@ -4140,8 +4471,8 @@
         <w:pStyle w:val="Heading3"/>
         <w:rPr/>
       </w:pPr>
-      <w:bookmarkStart w:colFirst="0" w:colLast="0" w:name="_35rfydvcbj6e" w:id="25"/>
-      <w:bookmarkEnd w:id="25"/>
+      <w:bookmarkStart w:colFirst="0" w:colLast="0" w:name="_35rfydvcbj6e" w:id="27"/>
+      <w:bookmarkEnd w:id="27"/>
       <w:r>
         <w:rPr>
           <w:rtl w:val="0"/>
@@ -4153,8 +4484,8 @@
         <w:pStyle w:val="Heading3"/>
         <w:rPr/>
       </w:pPr>
-      <w:bookmarkStart w:colFirst="0" w:colLast="0" w:name="_bfm2go8kq3l1" w:id="26"/>
-      <w:bookmarkEnd w:id="26"/>
+      <w:bookmarkStart w:colFirst="0" w:colLast="0" w:name="_bfm2go8kq3l1" w:id="28"/>
+      <w:bookmarkEnd w:id="28"/>
       <w:r>
         <w:rPr>
           <w:rtl w:val="0"/>
@@ -4166,8 +4497,8 @@
         <w:pStyle w:val="Heading3"/>
         <w:rPr/>
       </w:pPr>
-      <w:bookmarkStart w:colFirst="0" w:colLast="0" w:name="_uubzrnxo739c" w:id="27"/>
-      <w:bookmarkEnd w:id="27"/>
+      <w:bookmarkStart w:colFirst="0" w:colLast="0" w:name="_uubzrnxo739c" w:id="29"/>
+      <w:bookmarkEnd w:id="29"/>
       <w:r>
         <w:rPr>
           <w:rtl w:val="0"/>
@@ -4179,8 +4510,8 @@
         <w:pStyle w:val="Heading3"/>
         <w:rPr/>
       </w:pPr>
-      <w:bookmarkStart w:colFirst="0" w:colLast="0" w:name="_1hc93ftduj8u" w:id="28"/>
-      <w:bookmarkEnd w:id="28"/>
+      <w:bookmarkStart w:colFirst="0" w:colLast="0" w:name="_1hc93ftduj8u" w:id="30"/>
+      <w:bookmarkEnd w:id="30"/>
       <w:r>
         <w:rPr>
           <w:rtl w:val="0"/>
@@ -4237,8 +4568,8 @@
         <w:pStyle w:val="Heading3"/>
         <w:rPr/>
       </w:pPr>
-      <w:bookmarkStart w:colFirst="0" w:colLast="0" w:name="_c4wnemnf72ge" w:id="29"/>
-      <w:bookmarkEnd w:id="29"/>
+      <w:bookmarkStart w:colFirst="0" w:colLast="0" w:name="_c4wnemnf72ge" w:id="31"/>
+      <w:bookmarkEnd w:id="31"/>
       <w:r>
         <w:rPr>
           <w:rtl w:val="0"/>
@@ -4250,8 +4581,8 @@
         <w:pStyle w:val="Heading3"/>
         <w:rPr/>
       </w:pPr>
-      <w:bookmarkStart w:colFirst="0" w:colLast="0" w:name="_zfpt9ir4pskd" w:id="30"/>
-      <w:bookmarkEnd w:id="30"/>
+      <w:bookmarkStart w:colFirst="0" w:colLast="0" w:name="_zfpt9ir4pskd" w:id="32"/>
+      <w:bookmarkEnd w:id="32"/>
       <w:r>
         <w:rPr>
           <w:rtl w:val="0"/>
@@ -4295,8 +4626,8 @@
         <w:pStyle w:val="Heading3"/>
         <w:rPr/>
       </w:pPr>
-      <w:bookmarkStart w:colFirst="0" w:colLast="0" w:name="_wtmltat0jxhl" w:id="31"/>
-      <w:bookmarkEnd w:id="31"/>
+      <w:bookmarkStart w:colFirst="0" w:colLast="0" w:name="_wtmltat0jxhl" w:id="33"/>
+      <w:bookmarkEnd w:id="33"/>
       <w:r>
         <w:rPr>
           <w:rtl w:val="0"/>
@@ -4343,8 +4674,8 @@
         <w:pStyle w:val="Subtitle"/>
         <w:rPr/>
       </w:pPr>
-      <w:bookmarkStart w:colFirst="0" w:colLast="0" w:name="_sv3fxrwunlqd" w:id="32"/>
-      <w:bookmarkEnd w:id="32"/>
+      <w:bookmarkStart w:colFirst="0" w:colLast="0" w:name="_sv3fxrwunlqd" w:id="34"/>
+      <w:bookmarkEnd w:id="34"/>
       <w:r>
         <w:rPr>
           <w:rtl w:val="0"/>
@@ -4367,8 +4698,8 @@
         <w:pStyle w:val="Heading3"/>
         <w:rPr/>
       </w:pPr>
-      <w:bookmarkStart w:colFirst="0" w:colLast="0" w:name="_ehdwdzt8gy4l" w:id="33"/>
-      <w:bookmarkEnd w:id="33"/>
+      <w:bookmarkStart w:colFirst="0" w:colLast="0" w:name="_ehdwdzt8gy4l" w:id="35"/>
+      <w:bookmarkEnd w:id="35"/>
       <w:r>
         <w:rPr>
           <w:rtl w:val="0"/>
@@ -4402,8 +4733,8 @@
         <w:pStyle w:val="Heading3"/>
         <w:rPr/>
       </w:pPr>
-      <w:bookmarkStart w:colFirst="0" w:colLast="0" w:name="_jinka7uh0mp" w:id="34"/>
-      <w:bookmarkEnd w:id="34"/>
+      <w:bookmarkStart w:colFirst="0" w:colLast="0" w:name="_jinka7uh0mp" w:id="36"/>
+      <w:bookmarkEnd w:id="36"/>
       <w:r>
         <w:rPr>
           <w:rtl w:val="0"/>
@@ -4437,8 +4768,8 @@
         <w:pStyle w:val="Heading3"/>
         <w:rPr/>
       </w:pPr>
-      <w:bookmarkStart w:colFirst="0" w:colLast="0" w:name="_trwb8gbvnjrt" w:id="35"/>
-      <w:bookmarkEnd w:id="35"/>
+      <w:bookmarkStart w:colFirst="0" w:colLast="0" w:name="_trwb8gbvnjrt" w:id="37"/>
+      <w:bookmarkEnd w:id="37"/>
       <w:r>
         <w:rPr>
           <w:rtl w:val="0"/>
@@ -4472,8 +4803,8 @@
         <w:pStyle w:val="Subtitle"/>
         <w:rPr/>
       </w:pPr>
-      <w:bookmarkStart w:colFirst="0" w:colLast="0" w:name="_tgfdqc79i3o" w:id="36"/>
-      <w:bookmarkEnd w:id="36"/>
+      <w:bookmarkStart w:colFirst="0" w:colLast="0" w:name="_tgfdqc79i3o" w:id="38"/>
+      <w:bookmarkEnd w:id="38"/>
       <w:r>
         <w:rPr>
           <w:rtl w:val="0"/>
@@ -4505,8 +4836,8 @@
         <w:pStyle w:val="Title"/>
         <w:rPr/>
       </w:pPr>
-      <w:bookmarkStart w:colFirst="0" w:colLast="0" w:name="_huwuskfzpzg9" w:id="37"/>
-      <w:bookmarkEnd w:id="37"/>
+      <w:bookmarkStart w:colFirst="0" w:colLast="0" w:name="_huwuskfzpzg9" w:id="39"/>
+      <w:bookmarkEnd w:id="39"/>
       <w:r>
         <w:rPr>
           <w:rtl w:val="0"/>
@@ -4529,8 +4860,8 @@
         <w:pStyle w:val="Subtitle"/>
         <w:rPr/>
       </w:pPr>
-      <w:bookmarkStart w:colFirst="0" w:colLast="0" w:name="_jzjicwgeck2v" w:id="38"/>
-      <w:bookmarkEnd w:id="38"/>
+      <w:bookmarkStart w:colFirst="0" w:colLast="0" w:name="_jzjicwgeck2v" w:id="40"/>
+      <w:bookmarkEnd w:id="40"/>
       <w:r>
         <w:rPr>
           <w:rtl w:val="0"/>
@@ -4564,8 +4895,8 @@
         <w:pStyle w:val="Subtitle"/>
         <w:rPr/>
       </w:pPr>
-      <w:bookmarkStart w:colFirst="0" w:colLast="0" w:name="_wn82ssb74gdk" w:id="39"/>
-      <w:bookmarkEnd w:id="39"/>
+      <w:bookmarkStart w:colFirst="0" w:colLast="0" w:name="_wn82ssb74gdk" w:id="41"/>
+      <w:bookmarkEnd w:id="41"/>
       <w:r>
         <w:rPr>
           <w:rtl w:val="0"/>
@@ -4588,8 +4919,8 @@
         <w:pStyle w:val="Heading3"/>
         <w:rPr/>
       </w:pPr>
-      <w:bookmarkStart w:colFirst="0" w:colLast="0" w:name="_9i2g16r8tj7s" w:id="40"/>
-      <w:bookmarkEnd w:id="40"/>
+      <w:bookmarkStart w:colFirst="0" w:colLast="0" w:name="_9i2g16r8tj7s" w:id="42"/>
+      <w:bookmarkEnd w:id="42"/>
       <w:r>
         <w:rPr>
           <w:rtl w:val="0"/>
@@ -4623,8 +4954,8 @@
         <w:pStyle w:val="Heading3"/>
         <w:rPr/>
       </w:pPr>
-      <w:bookmarkStart w:colFirst="0" w:colLast="0" w:name="_cdohbypo7a76" w:id="41"/>
-      <w:bookmarkEnd w:id="41"/>
+      <w:bookmarkStart w:colFirst="0" w:colLast="0" w:name="_cdohbypo7a76" w:id="43"/>
+      <w:bookmarkEnd w:id="43"/>
       <w:r>
         <w:rPr>
           <w:rtl w:val="0"/>
@@ -4658,8 +4989,8 @@
         <w:pStyle w:val="Heading3"/>
         <w:rPr/>
       </w:pPr>
-      <w:bookmarkStart w:colFirst="0" w:colLast="0" w:name="_yns5rzybghog" w:id="42"/>
-      <w:bookmarkEnd w:id="42"/>
+      <w:bookmarkStart w:colFirst="0" w:colLast="0" w:name="_yns5rzybghog" w:id="44"/>
+      <w:bookmarkEnd w:id="44"/>
       <w:r>
         <w:rPr>
           <w:rtl w:val="0"/>
@@ -4693,8 +5024,8 @@
         <w:pStyle w:val="Subtitle"/>
         <w:rPr/>
       </w:pPr>
-      <w:bookmarkStart w:colFirst="0" w:colLast="0" w:name="_j0i5eueol7kr" w:id="43"/>
-      <w:bookmarkEnd w:id="43"/>
+      <w:bookmarkStart w:colFirst="0" w:colLast="0" w:name="_j0i5eueol7kr" w:id="45"/>
+      <w:bookmarkEnd w:id="45"/>
       <w:r>
         <w:rPr>
           <w:rtl w:val="0"/>
@@ -4728,8 +5059,8 @@
         <w:pStyle w:val="Subtitle"/>
         <w:rPr/>
       </w:pPr>
-      <w:bookmarkStart w:colFirst="0" w:colLast="0" w:name="_y2xow5h0apl" w:id="44"/>
-      <w:bookmarkEnd w:id="44"/>
+      <w:bookmarkStart w:colFirst="0" w:colLast="0" w:name="_y2xow5h0apl" w:id="46"/>
+      <w:bookmarkEnd w:id="46"/>
       <w:r>
         <w:rPr>
           <w:rtl w:val="0"/>
@@ -4741,7 +5072,7 @@
       <w:pPr>
         <w:rPr/>
         <w:sectPr>
-          <w:headerReference r:id="rId9" w:type="default"/>
+          <w:headerReference r:id="rId10" w:type="default"/>
           <w:type w:val="nextPage"/>
           <w:pgSz w:h="16834" w:w="11909" w:orient="portrait"/>
           <w:pgMar w:bottom="1133.8582677165355" w:top="1700.7874015748032" w:left="1700.7874015748032" w:right="1133.8582677165355" w:header="720" w:footer="720"/>
@@ -4759,8 +5090,8 @@
         <w:pStyle w:val="Title"/>
         <w:rPr/>
       </w:pPr>
-      <w:bookmarkStart w:colFirst="0" w:colLast="0" w:name="_n5boaojb6c4e" w:id="45"/>
-      <w:bookmarkEnd w:id="45"/>
+      <w:bookmarkStart w:colFirst="0" w:colLast="0" w:name="_n5boaojb6c4e" w:id="47"/>
+      <w:bookmarkEnd w:id="47"/>
       <w:r>
         <w:rPr>
           <w:rtl w:val="0"/>
@@ -4838,7 +5169,7 @@
         </w:rPr>
         <w:t xml:space="preserve">[4] KEMP, S. The global state of digital in April 2023. We Are Social UK, 27 abr. 2023. Disponível em: </w:t>
       </w:r>
-      <w:hyperlink r:id="rId10">
+      <w:hyperlink r:id="rId11">
         <w:r>
           <w:rPr>
             <w:color w:val="0563c1"/>
@@ -4943,7 +5274,7 @@
         </w:rPr>
         <w:t xml:space="preserve">[9] Nip, J. Y. M., &amp; Berthelier, B. (2024). Social Media Sentiment Analysis. Encyclopedia, 4(4), 1590-1598. </w:t>
       </w:r>
-      <w:hyperlink r:id="rId11">
+      <w:hyperlink r:id="rId12">
         <w:r>
           <w:rPr>
             <w:color w:val="0563c1"/>
@@ -5239,7 +5570,7 @@
       <w:lvlText w:val="●"/>
       <w:lvlJc w:val="left"/>
       <w:pPr>
-        <w:ind w:left="720" w:hanging="360"/>
+        <w:ind w:left="1440" w:hanging="360"/>
       </w:pPr>
       <w:rPr>
         <w:u w:val="none"/>
@@ -5251,7 +5582,7 @@
       <w:lvlText w:val="○"/>
       <w:lvlJc w:val="left"/>
       <w:pPr>
-        <w:ind w:left="1440" w:hanging="360"/>
+        <w:ind w:left="2160" w:hanging="360"/>
       </w:pPr>
       <w:rPr>
         <w:u w:val="none"/>
@@ -5263,7 +5594,7 @@
       <w:lvlText w:val="■"/>
       <w:lvlJc w:val="left"/>
       <w:pPr>
-        <w:ind w:left="2160" w:hanging="360"/>
+        <w:ind w:left="2880" w:hanging="360"/>
       </w:pPr>
       <w:rPr>
         <w:u w:val="none"/>
@@ -5275,7 +5606,7 @@
       <w:lvlText w:val="●"/>
       <w:lvlJc w:val="left"/>
       <w:pPr>
-        <w:ind w:left="2880" w:hanging="360"/>
+        <w:ind w:left="3600" w:hanging="360"/>
       </w:pPr>
       <w:rPr>
         <w:u w:val="none"/>
@@ -5287,7 +5618,7 @@
       <w:lvlText w:val="○"/>
       <w:lvlJc w:val="left"/>
       <w:pPr>
-        <w:ind w:left="3600" w:hanging="360"/>
+        <w:ind w:left="4320" w:hanging="360"/>
       </w:pPr>
       <w:rPr>
         <w:u w:val="none"/>
@@ -5299,7 +5630,7 @@
       <w:lvlText w:val="■"/>
       <w:lvlJc w:val="left"/>
       <w:pPr>
-        <w:ind w:left="4320" w:hanging="360"/>
+        <w:ind w:left="5040" w:hanging="360"/>
       </w:pPr>
       <w:rPr>
         <w:u w:val="none"/>
@@ -5311,7 +5642,7 @@
       <w:lvlText w:val="●"/>
       <w:lvlJc w:val="left"/>
       <w:pPr>
-        <w:ind w:left="5040" w:hanging="360"/>
+        <w:ind w:left="5760" w:hanging="360"/>
       </w:pPr>
       <w:rPr>
         <w:u w:val="none"/>
@@ -5323,7 +5654,7 @@
       <w:lvlText w:val="○"/>
       <w:lvlJc w:val="left"/>
       <w:pPr>
-        <w:ind w:left="5760" w:hanging="360"/>
+        <w:ind w:left="6480" w:hanging="360"/>
       </w:pPr>
       <w:rPr>
         <w:u w:val="none"/>
@@ -5335,6 +5666,226 @@
       <w:lvlText w:val="■"/>
       <w:lvlJc w:val="left"/>
       <w:pPr>
+        <w:ind w:left="7200" w:hanging="360"/>
+      </w:pPr>
+      <w:rPr>
+        <w:u w:val="none"/>
+      </w:rPr>
+    </w:lvl>
+  </w:abstractNum>
+  <w:abstractNum w:abstractNumId="2">
+    <w:lvl w:ilvl="0">
+      <w:start w:val="1"/>
+      <w:numFmt w:val="bullet"/>
+      <w:lvlText w:val="●"/>
+      <w:lvlJc w:val="left"/>
+      <w:pPr>
+        <w:ind w:left="1440" w:hanging="360"/>
+      </w:pPr>
+      <w:rPr>
+        <w:u w:val="none"/>
+      </w:rPr>
+    </w:lvl>
+    <w:lvl w:ilvl="1">
+      <w:start w:val="1"/>
+      <w:numFmt w:val="bullet"/>
+      <w:lvlText w:val="○"/>
+      <w:lvlJc w:val="left"/>
+      <w:pPr>
+        <w:ind w:left="2160" w:hanging="360"/>
+      </w:pPr>
+      <w:rPr>
+        <w:u w:val="none"/>
+      </w:rPr>
+    </w:lvl>
+    <w:lvl w:ilvl="2">
+      <w:start w:val="1"/>
+      <w:numFmt w:val="bullet"/>
+      <w:lvlText w:val="■"/>
+      <w:lvlJc w:val="left"/>
+      <w:pPr>
+        <w:ind w:left="2880" w:hanging="360"/>
+      </w:pPr>
+      <w:rPr>
+        <w:u w:val="none"/>
+      </w:rPr>
+    </w:lvl>
+    <w:lvl w:ilvl="3">
+      <w:start w:val="1"/>
+      <w:numFmt w:val="bullet"/>
+      <w:lvlText w:val="●"/>
+      <w:lvlJc w:val="left"/>
+      <w:pPr>
+        <w:ind w:left="3600" w:hanging="360"/>
+      </w:pPr>
+      <w:rPr>
+        <w:u w:val="none"/>
+      </w:rPr>
+    </w:lvl>
+    <w:lvl w:ilvl="4">
+      <w:start w:val="1"/>
+      <w:numFmt w:val="bullet"/>
+      <w:lvlText w:val="○"/>
+      <w:lvlJc w:val="left"/>
+      <w:pPr>
+        <w:ind w:left="4320" w:hanging="360"/>
+      </w:pPr>
+      <w:rPr>
+        <w:u w:val="none"/>
+      </w:rPr>
+    </w:lvl>
+    <w:lvl w:ilvl="5">
+      <w:start w:val="1"/>
+      <w:numFmt w:val="bullet"/>
+      <w:lvlText w:val="■"/>
+      <w:lvlJc w:val="left"/>
+      <w:pPr>
+        <w:ind w:left="5040" w:hanging="360"/>
+      </w:pPr>
+      <w:rPr>
+        <w:u w:val="none"/>
+      </w:rPr>
+    </w:lvl>
+    <w:lvl w:ilvl="6">
+      <w:start w:val="1"/>
+      <w:numFmt w:val="bullet"/>
+      <w:lvlText w:val="●"/>
+      <w:lvlJc w:val="left"/>
+      <w:pPr>
+        <w:ind w:left="5760" w:hanging="360"/>
+      </w:pPr>
+      <w:rPr>
+        <w:u w:val="none"/>
+      </w:rPr>
+    </w:lvl>
+    <w:lvl w:ilvl="7">
+      <w:start w:val="1"/>
+      <w:numFmt w:val="bullet"/>
+      <w:lvlText w:val="○"/>
+      <w:lvlJc w:val="left"/>
+      <w:pPr>
+        <w:ind w:left="6480" w:hanging="360"/>
+      </w:pPr>
+      <w:rPr>
+        <w:u w:val="none"/>
+      </w:rPr>
+    </w:lvl>
+    <w:lvl w:ilvl="8">
+      <w:start w:val="1"/>
+      <w:numFmt w:val="bullet"/>
+      <w:lvlText w:val="■"/>
+      <w:lvlJc w:val="left"/>
+      <w:pPr>
+        <w:ind w:left="7200" w:hanging="360"/>
+      </w:pPr>
+      <w:rPr>
+        <w:u w:val="none"/>
+      </w:rPr>
+    </w:lvl>
+  </w:abstractNum>
+  <w:abstractNum w:abstractNumId="3">
+    <w:lvl w:ilvl="0">
+      <w:start w:val="1"/>
+      <w:numFmt w:val="bullet"/>
+      <w:lvlText w:val="●"/>
+      <w:lvlJc w:val="left"/>
+      <w:pPr>
+        <w:ind w:left="720" w:hanging="360"/>
+      </w:pPr>
+      <w:rPr>
+        <w:u w:val="none"/>
+      </w:rPr>
+    </w:lvl>
+    <w:lvl w:ilvl="1">
+      <w:start w:val="1"/>
+      <w:numFmt w:val="bullet"/>
+      <w:lvlText w:val="○"/>
+      <w:lvlJc w:val="left"/>
+      <w:pPr>
+        <w:ind w:left="1440" w:hanging="360"/>
+      </w:pPr>
+      <w:rPr>
+        <w:u w:val="none"/>
+      </w:rPr>
+    </w:lvl>
+    <w:lvl w:ilvl="2">
+      <w:start w:val="1"/>
+      <w:numFmt w:val="bullet"/>
+      <w:lvlText w:val="■"/>
+      <w:lvlJc w:val="left"/>
+      <w:pPr>
+        <w:ind w:left="2160" w:hanging="360"/>
+      </w:pPr>
+      <w:rPr>
+        <w:u w:val="none"/>
+      </w:rPr>
+    </w:lvl>
+    <w:lvl w:ilvl="3">
+      <w:start w:val="1"/>
+      <w:numFmt w:val="bullet"/>
+      <w:lvlText w:val="●"/>
+      <w:lvlJc w:val="left"/>
+      <w:pPr>
+        <w:ind w:left="2880" w:hanging="360"/>
+      </w:pPr>
+      <w:rPr>
+        <w:u w:val="none"/>
+      </w:rPr>
+    </w:lvl>
+    <w:lvl w:ilvl="4">
+      <w:start w:val="1"/>
+      <w:numFmt w:val="bullet"/>
+      <w:lvlText w:val="○"/>
+      <w:lvlJc w:val="left"/>
+      <w:pPr>
+        <w:ind w:left="3600" w:hanging="360"/>
+      </w:pPr>
+      <w:rPr>
+        <w:u w:val="none"/>
+      </w:rPr>
+    </w:lvl>
+    <w:lvl w:ilvl="5">
+      <w:start w:val="1"/>
+      <w:numFmt w:val="bullet"/>
+      <w:lvlText w:val="■"/>
+      <w:lvlJc w:val="left"/>
+      <w:pPr>
+        <w:ind w:left="4320" w:hanging="360"/>
+      </w:pPr>
+      <w:rPr>
+        <w:u w:val="none"/>
+      </w:rPr>
+    </w:lvl>
+    <w:lvl w:ilvl="6">
+      <w:start w:val="1"/>
+      <w:numFmt w:val="bullet"/>
+      <w:lvlText w:val="●"/>
+      <w:lvlJc w:val="left"/>
+      <w:pPr>
+        <w:ind w:left="5040" w:hanging="360"/>
+      </w:pPr>
+      <w:rPr>
+        <w:u w:val="none"/>
+      </w:rPr>
+    </w:lvl>
+    <w:lvl w:ilvl="7">
+      <w:start w:val="1"/>
+      <w:numFmt w:val="bullet"/>
+      <w:lvlText w:val="○"/>
+      <w:lvlJc w:val="left"/>
+      <w:pPr>
+        <w:ind w:left="5760" w:hanging="360"/>
+      </w:pPr>
+      <w:rPr>
+        <w:u w:val="none"/>
+      </w:rPr>
+    </w:lvl>
+    <w:lvl w:ilvl="8">
+      <w:start w:val="1"/>
+      <w:numFmt w:val="bullet"/>
+      <w:lvlText w:val="■"/>
+      <w:lvlJc w:val="left"/>
+      <w:pPr>
         <w:ind w:left="6480" w:hanging="360"/>
       </w:pPr>
       <w:rPr>
@@ -5344,6 +5895,12 @@
   </w:abstractNum>
   <w:num w:numId="1">
     <w:abstractNumId w:val="1"/>
+  </w:num>
+  <w:num w:numId="2">
+    <w:abstractNumId w:val="2"/>
+  </w:num>
+  <w:num w:numId="3">
+    <w:abstractNumId w:val="3"/>
   </w:num>
 </w:numbering>
 </file>

</xml_diff>

<commit_message>
Updated Relatorio_PGC and Added Victor annotation files - Cloroquina [0:150]
</commit_message>
<xml_diff>
--- a/docs/PGC_ANALISE_DE_CONFLITOS_EM_REDES_SOCIAIS.docx
+++ b/docs/PGC_ANALISE_DE_CONFLITOS_EM_REDES_SOCIAIS.docx
@@ -2938,7 +2938,7 @@
         <w:rPr>
           <w:rtl w:val="0"/>
         </w:rPr>
-        <w:t xml:space="preserve">A estrutura interna do BERT é baseada na arquitetura Transformer proposta por Vaswani et al. (2017), utilizando exclusivamente a porção codificadora (Encoder) da arquitetura original [1]. O modelo é formado por diversas camadas empilhadas, cada uma composta por mecanismos de autoatenção (self-attention) e redes neurais feed-forward. Essas camadas trabalham em conjunto para construir representações contextuais cada vez mais ricas dos textos de entrada. [1].</w:t>
+        <w:t xml:space="preserve">A estrutura interna do BERT é baseada na arquitetura Transformer proposta por Vaswani et al. (2017), utilizando exclusivamente a porção codificadora (Encoder) da arquitetura original [1]. O modelo é formado por diversas camadas empilhadas, cada uma composta por mecanismos de autoatenção (self-attention) e redes neurais feed-forward. Essas camadas trabalham em conjunto para construir representações contextuais cada vez mais ricas dos textos de entrada [1].</w:t>
       </w:r>
     </w:p>
     <w:p>
@@ -3208,12 +3208,12 @@
           <wp:inline distB="114300" distT="114300" distL="114300" distR="114300">
             <wp:extent cx="5697038" cy="1729286"/>
             <wp:effectExtent b="0" l="0" r="0" t="0"/>
-            <wp:docPr id="2" name="image3.png"/>
+            <wp:docPr id="2" name="image2.png"/>
             <a:graphic>
               <a:graphicData uri="http://schemas.openxmlformats.org/drawingml/2006/picture">
                 <pic:pic>
                   <pic:nvPicPr>
-                    <pic:cNvPr id="0" name="image3.png"/>
+                    <pic:cNvPr id="0" name="image2.png"/>
                     <pic:cNvPicPr preferRelativeResize="0"/>
                   </pic:nvPicPr>
                   <pic:blipFill>
@@ -3324,7 +3324,7 @@
         <w:rPr>
           <w:rtl w:val="0"/>
         </w:rPr>
-        <w:t xml:space="preserve">Uma das principais contribuições do BERT é a introdução de representações profundamente bidirecionais. Modelos anteriores geralmente realizavam treinamento da esquerda para a direita ou combinavam separadamente representações obtidas em cada direção. O OpenAI GPT, por exemplo, utilizava um Transformer treinado da esquerda para a direita, enquanto o ELMo combinava representações geradas independentemente a partir dos contextos esquerdo e direito da sequência [1]. Em contrapartida, o BERT aprende simultaneamente a partir dos contextos anteriores e posteriores de cada palavra durante o pré-treinamento [1].</w:t>
+        <w:t xml:space="preserve">Uma das principais contribuições do BERT é a introdução de representações contextuais bidirecionais. Modelos anteriores geralmente realizavam treinamento da esquerda para a direita ou combinavam separadamente representações obtidas em cada direção. O OpenAI GPT, por exemplo, utilizava um Transformer treinado da esquerda para a direita, enquanto o ELMo combinava representações geradas independentemente a partir dos contextos esquerdo e direito da sequência [1]. Em contrapartida, o BERT aprende simultaneamente a partir dos contextos anteriores e posteriores de cada palavra durante o pré-treinamento [1].</w:t>
       </w:r>
     </w:p>
     <w:p>
@@ -3373,12 +3373,12 @@
           <wp:inline distB="114300" distT="114300" distL="114300" distR="114300">
             <wp:extent cx="5760000" cy="1346200"/>
             <wp:effectExtent b="0" l="0" r="0" t="0"/>
-            <wp:docPr id="1" name="image2.png"/>
+            <wp:docPr id="1" name="image3.png"/>
             <a:graphic>
               <a:graphicData uri="http://schemas.openxmlformats.org/drawingml/2006/picture">
                 <pic:pic>
                   <pic:nvPicPr>
-                    <pic:cNvPr id="0" name="image2.png"/>
+                    <pic:cNvPr id="0" name="image3.png"/>
                     <pic:cNvPicPr preferRelativeResize="0"/>
                   </pic:nvPicPr>
                   <pic:blipFill>
@@ -3440,7 +3440,7 @@
         <w:rPr>
           <w:rtl w:val="0"/>
         </w:rPr>
-        <w:t xml:space="preserve">Segundo Devlin et al. [1], as representações profundamente bidirecionais permitiram ao modelo alcançar resultados superiores em diversos benchmarks de Processamento de Linguagem Natural quando comparado a abordagens anteriores. Estudos posteriores revisados por Rogers et al. [2], indicam que essas representações codificam diferentes níveis de conhecimento linguístico, contribuindo para desempenho positivo do modelo em tarefas distintas de compreensão e classificação de textos.</w:t>
+        <w:t xml:space="preserve">Segundo Devlin et al. [1], as representações profundamente bidirecionais permitiram ao modelo alcançar resultados superiores em diversos benchmarks de Processamento de Linguagem Natural quando comparado a abordagens anteriores. Estudos posteriores revisados por Rogers et al. [2], indicam que essas representações codificam diferentes níveis de conhecimento linguístico, contribuindo para o desempenho positivo do modelo em tarefas distintas de compreensão e classificação de textos.</w:t>
       </w:r>
     </w:p>
     <w:p>
@@ -3488,7 +3488,21 @@
         <w:rPr>
           <w:rtl w:val="0"/>
         </w:rPr>
-        <w:t xml:space="preserve">O treinamento do modelo BERT é dividido em duas etapas principais: o pré-treinamento e o ajuste fino (fine-tuning) [1]. Na etapa de pré-treinamento, o modelo é exposto a grandes corpora de texto não rotulado com o objetivo de aprender representações linguísticas que possam ser posteriormente transferidas para diferentes tarefas de Processamento de Linguagem Natural [1].</w:t>
+        <w:t xml:space="preserve">O treinamento do modelo BERT é dividido em duas etapas principais: o pré-treinamento e o ajuste fino (fine-tuning) [1]. Na etapa de pré-treinamento, o modelo é exposto a grandes corpora de texto não rotulado com o objetivo de aprender representações linguísticas que possam ser posteriormente transferidas para diferentes tarefas de Processamento de Linguagem Natural [1]. Para isso, Devlin et al. [1] realizaram o pré-treinamento utilizando a combinação do </w:t>
+      </w:r>
+      <w:r>
+        <w:rPr>
+          <w:i w:val="1"/>
+          <w:iCs w:val="1"/>
+          <w:rtl w:val="0"/>
+        </w:rPr>
+        <w:t xml:space="preserve">BooksCorpus</w:t>
+      </w:r>
+      <w:r>
+        <w:rPr>
+          <w:rtl w:val="0"/>
+        </w:rPr>
+        <w:t xml:space="preserve"> (aproximadamente 800 milhões de palavras) e da versão em inglês da Wikipédia (cerca de 2,5 bilhões de palavras), totalizando bilhões de palavras para o aprendizado dos parâmetros do modelo. </w:t>
       </w:r>
     </w:p>
     <w:p>
@@ -3765,7 +3779,19 @@
         <w:rPr>
           <w:rtl w:val="0"/>
         </w:rPr>
-        <w:t xml:space="preserve">Segundo Devlin et al. [1], essa estratégia permite que a mesma arquitetura seja aplicada em tarefas distintas, como classificação de textos, análise de sentimento, inferência textual, reconhecimento de entidades nomeadas e sistemas de perguntas e respostas, exigindo apenas pequenas modificações na camada final [1]. Para tarefas de classificação textual, a representação final associada ao token [CLS] é utilizada como representação da sequência completa, sendo conectada a uma camada de saída responsável pela predição da classe desejada [1].</w:t>
+        <w:t xml:space="preserve">Segundo Devlin et al. [1], o processo de ajuste fino permite que a mesma arquitetura pré-treinada seja adaptada para diferentes tarefas de Processamento de Linguagem Natural, exigindo apenas pequenas modificações na camada de saída. Em tarefas de classificação textual, a representação final associada ao token [CLS] é utilizada como representação da sequência completa, sendo conectada a uma camada responsável pela predição da classe desejada [1].</w:t>
+      </w:r>
+    </w:p>
+    <w:p>
+      <w:pPr>
+        <w:ind w:firstLine="720"/>
+        <w:rPr/>
+      </w:pPr>
+      <w:r>
+        <w:rPr>
+          <w:rtl w:val="0"/>
+        </w:rPr>
+        <w:t xml:space="preserve">Essa estratégia de pré-treinamento seguido de ajuste fino impulsionou o uso do BERT em tarefas como classificação de textos, análise de sentimentos, inferência textual, reconhecimento de entidades nomeadas, sistemas de perguntas e respostas e, mais recentemente, na detecção de conteúdos ofensivos e comportamentos agressivos em mídias sociais [1,4,5]. A utilização do BERT em problemas relacionados à identificação de conflitos será discutida com maior detalhamento na Seção 3.8.</w:t>
       </w:r>
     </w:p>
     <w:p>
@@ -3812,7 +3838,50 @@
         <w:rPr>
           <w:rtl w:val="0"/>
         </w:rPr>
-        <w:t xml:space="preserve">Comentar que é um modelo BERT adaptado para o português; citar o corpus usado, vantagens, e uso em aplicações PLN em português</w:t>
+      </w:r>
+    </w:p>
+    <w:p>
+      <w:pPr>
+        <w:rPr/>
+      </w:pPr>
+      <w:r>
+        <w:rPr>
+          <w:rtl w:val="0"/>
+        </w:rPr>
+        <w:t xml:space="preserve">Embora o BERT tenha sido originalmente desenvolvido para a língua inglesa, Souza et al. [6] propuseram o BERTimbau, uma versão do modelo pré-treinada especificamente para o português brasileiro. O objetivo do trabalho foi desenvolver modelos de linguagem baseados na arquitetura BERT treinados em um grande corpus de textos em português, favorecendo a produção de representações linguísticas mais adequadas às particularidades léxicas, sintáticas e morfológicas do idioma [6]. </w:t>
+      </w:r>
+    </w:p>
+    <w:p>
+      <w:pPr>
+        <w:rPr/>
+      </w:pPr>
+      <w:r>
+        <w:rPr>
+          <w:rtl w:val="0"/>
+        </w:rPr>
+        <w:t xml:space="preserve">Para o treinamento, os autores utilizaram o corpus brWaC (Brazilian Web as Corpus), composto por aproximadamente 2,7 bilhões de tokens obtidos de páginas da Web em português brasileiro [6]. O treinamento seguiu a mesma arquitetura e o mesmo procedimento de pré-treinamento adotados pelo BERT original, discutido na Seção 3.6 [1,6].</w:t>
+      </w:r>
+    </w:p>
+    <w:p>
+      <w:pPr>
+        <w:rPr/>
+      </w:pPr>
+      <w:r>
+        <w:rPr>
+          <w:rtl w:val="0"/>
+        </w:rPr>
+        <w:t xml:space="preserve">Assim como no modelo original, foram disponibilizadas duas configurações: BERTimbau Base e BERTimbau Large [6]. Os autores avaliaram ambos os modelos em diferentes tarefas de Processamento de Linguagem Natural para o português brasileiro, incluindo reconhecimento de entidades nomeadas, inferência textual e similaridade semântica textual. Os resultados experimentais demonstraram que o BERTimbau superou modelos multilíngues previamente utilizados para o português, incluindo o Multilingual BERT (mBERT), alcançando resultados superiores nos conjuntos de dados avaliados [6].</w:t>
+      </w:r>
+    </w:p>
+    <w:p>
+      <w:pPr>
+        <w:rPr/>
+      </w:pPr>
+      <w:r>
+        <w:rPr>
+          <w:rtl w:val="0"/>
+        </w:rPr>
+        <w:t xml:space="preserve">Os resultados obtidos por Souza et al. [6] evidenciam o potencial de modelos pré-treinados especificamente para o português brasileiro na construção de representações linguísticas mais adequadas para tarefas de PLN específicas ao idioma. Por esse motivo, neste trabalho optou-se pela utilização do BERTimbau como modelo base para a tarefa de classificação de conflitos em textos escritos em português.</w:t>
       </w:r>
     </w:p>
     <w:p>
@@ -5974,6 +6043,78 @@
           <w:rtl w:val="0"/>
         </w:rPr>
         <w:t xml:space="preserve">[2] Rogers A, Kovaleva O, Rumshisky A. A primer on BERTology: What what we know about how BERT works. Transactions of the Association for Computational Linguistics. 2020;8:842-866. doi:10.1162/tacl_a_00349.</w:t>
+      </w:r>
+    </w:p>
+    <w:p>
+      <w:pPr>
+        <w:spacing w:after="240" w:before="240" w:line="259" w:lineRule="auto"/>
+        <w:ind w:left="0" w:firstLine="0"/>
+        <w:rPr>
+          <w:sz w:val="22"/>
+          <w:szCs w:val="22"/>
+        </w:rPr>
+      </w:pPr>
+      <w:r>
+        <w:rPr>
+          <w:sz w:val="22"/>
+          <w:szCs w:val="22"/>
+          <w:rtl w:val="0"/>
+        </w:rPr>
+        <w:t xml:space="preserve">[3] Warke, O., Jose, J. M., Breitsohl, J., &amp; Wang, J. (2024, August). Capturing the Spectrum of Social Media Conflict: A Novel Multi-objective Classification Model. In Proceedings of the 2024 ACM SIGIR International Conference on Theory of Information Retrieval (pp. 215-225)</w:t>
+      </w:r>
+    </w:p>
+    <w:p>
+      <w:pPr>
+        <w:spacing w:after="240" w:before="240" w:line="259" w:lineRule="auto"/>
+        <w:ind w:left="0" w:firstLine="0"/>
+        <w:rPr>
+          <w:sz w:val="22"/>
+          <w:szCs w:val="22"/>
+        </w:rPr>
+      </w:pPr>
+      <w:r>
+        <w:rPr>
+          <w:sz w:val="22"/>
+          <w:szCs w:val="22"/>
+          <w:rtl w:val="0"/>
+        </w:rPr>
+        <w:t xml:space="preserve">[4] Samghabadi NS, Patwa P, Srinivas PYKL, Mukherjee P, Das A, Solorio T. Aggression and misogyny detection using BERT: A multi-task approach. In: Proceedings of the Second Workshop on Trolling, Aggression and Cyberbullying. Marseille: European Language Resources Association; 2020. p. 126–131.</w:t>
+      </w:r>
+    </w:p>
+    <w:p>
+      <w:pPr>
+        <w:spacing w:after="240" w:before="240" w:line="259" w:lineRule="auto"/>
+        <w:ind w:left="0" w:firstLine="0"/>
+        <w:rPr>
+          <w:sz w:val="22"/>
+          <w:szCs w:val="22"/>
+        </w:rPr>
+      </w:pPr>
+      <w:r>
+        <w:rPr>
+          <w:sz w:val="22"/>
+          <w:szCs w:val="22"/>
+          <w:rtl w:val="0"/>
+        </w:rPr>
+        <w:t xml:space="preserve">[5] Al-Makhadmeh Z, Tolba A. Detection of hate speech using BERT and hate speech word embedding with deep model. Applied Artificial Intelligence. 2021;35(15):2249–2262. doi:10.1080/08839514.2021.1994932.</w:t>
+      </w:r>
+    </w:p>
+    <w:p>
+      <w:pPr>
+        <w:spacing w:after="240" w:before="240" w:line="259" w:lineRule="auto"/>
+        <w:ind w:firstLine="0"/>
+        <w:rPr>
+          <w:sz w:val="22"/>
+          <w:szCs w:val="22"/>
+        </w:rPr>
+      </w:pPr>
+      <w:r>
+        <w:rPr>
+          <w:sz w:val="22"/>
+          <w:szCs w:val="22"/>
+          <w:rtl w:val="0"/>
+        </w:rPr>
+        <w:t xml:space="preserve">[6] Souza F, Nogueira R, Lotufo R. BERTimbau: Pretrained BERT Models for Brazilian Portuguese. In: Brazilian Conference on Intelligent Systems (BRACIS). 2020.</w:t>
       </w:r>
     </w:p>
     <w:sectPr>

</xml_diff>